<commit_message>
Proje 3 rapor: ASCII diyagramlar -> PNG gorsel + Gantt semasi eklendi
- generate_figures.py: matplotlib ile 4 profesyonel sekil uretir
  * fig_arch.png  : sistem mimarisi (PC toolchain -> UART -> SoC)
  * fig_packet.png: paket cercevesi (SYNC|CMD|LEN|ADDR|DATA|CRC16)
  * fig_fsm.png   : loader sonlu durum makinesi
  * fig_gantt.png : fazli zaman cizelgesi (Gantt)
- build_report.js: ASCII MONO diyagramlar PNG ImageRun ile degistirildi;
  Sekil 5.1 (Gantt) Bolum 5.1'e RACI yanina eklendi. Kod listeleri (T1/T2/T3)
  monospace metin olarak kaldi.
- BIL302_PROJE3.docx yeniden uretildi: 4 gomulu gorsel + 8 tablo, Courier New 10pt.

Co-Authored-By: Claude Opus 4.8 <noreply@anthropic.com>
</commit_message>
<xml_diff>
--- a/assembler_1/assembler_1/docs/report/BIL302_PROJE3.docx
+++ b/assembler_1/assembler_1/docs/report/BIL302_PROJE3.docx
@@ -1480,200 +1480,48 @@
     </w:p>
     <w:p>
       <w:pPr>
-        <w:shd w:fill="F2F2F2" w:val="clear"/>
-        <w:spacing w:after="0" w:line="230"/>
-      </w:pPr>
-      <w:r>
-        <w:rPr>
-          <w:rFonts w:ascii="Courier New" w:cs="Courier New" w:eastAsia="Courier New" w:hAnsi="Courier New"/>
-          <w:b w:val="false"/>
-          <w:bCs w:val="false"/>
-          <w:i w:val="false"/>
-          <w:iCs w:val="false"/>
-          <w:sz w:val="18"/>
-          <w:szCs w:val="18"/>
-        </w:rPr>
-        <w:t xml:space="preserve">   PC (host)                              Tang Nano 9K (GW1NR-9)</w:t>
-      </w:r>
-    </w:p>
-    <w:p>
-      <w:pPr>
-        <w:shd w:fill="F2F2F2" w:val="clear"/>
-        <w:spacing w:after="0" w:line="230"/>
-      </w:pPr>
-      <w:r>
-        <w:rPr>
-          <w:rFonts w:ascii="Courier New" w:cs="Courier New" w:eastAsia="Courier New" w:hAnsi="Courier New"/>
-          <w:b w:val="false"/>
-          <w:bCs w:val="false"/>
-          <w:i w:val="false"/>
-          <w:iCs w:val="false"/>
-          <w:sz w:val="18"/>
-          <w:szCs w:val="18"/>
-        </w:rPr>
-        <w:t xml:space="preserve"> +-------------+                        +-----------------------------+</w:t>
-      </w:r>
-    </w:p>
-    <w:p>
-      <w:pPr>
-        <w:shd w:fill="F2F2F2" w:val="clear"/>
-        <w:spacing w:after="0" w:line="230"/>
-      </w:pPr>
-      <w:r>
-        <w:rPr>
-          <w:rFonts w:ascii="Courier New" w:cs="Courier New" w:eastAsia="Courier New" w:hAnsi="Courier New"/>
-          <w:b w:val="false"/>
-          <w:bCs w:val="false"/>
-          <w:i w:val="false"/>
-          <w:iCs w:val="false"/>
-          <w:sz w:val="18"/>
-          <w:szCs w:val="18"/>
-        </w:rPr>
-        <w:t xml:space="preserve"> | uygulama.s  |                        |   PicoRV32  &lt;-&gt;  Bus/Decoder|</w:t>
-      </w:r>
-    </w:p>
-    <w:p>
-      <w:pPr>
-        <w:shd w:fill="F2F2F2" w:val="clear"/>
-        <w:spacing w:after="0" w:line="230"/>
-      </w:pPr>
-      <w:r>
-        <w:rPr>
-          <w:rFonts w:ascii="Courier New" w:cs="Courier New" w:eastAsia="Courier New" w:hAnsi="Courier New"/>
-          <w:b w:val="false"/>
-          <w:bCs w:val="false"/>
-          <w:i w:val="false"/>
-          <w:iCs w:val="false"/>
-          <w:sz w:val="18"/>
-          <w:szCs w:val="18"/>
-        </w:rPr>
-        <w:t xml:space="preserve"> |   |assembler|                        |      ^             |        |</w:t>
-      </w:r>
-    </w:p>
-    <w:p>
-      <w:pPr>
-        <w:shd w:fill="F2F2F2" w:val="clear"/>
-        <w:spacing w:after="0" w:line="230"/>
-      </w:pPr>
-      <w:r>
-        <w:rPr>
-          <w:rFonts w:ascii="Courier New" w:cs="Courier New" w:eastAsia="Courier New" w:hAnsi="Courier New"/>
-          <w:b w:val="false"/>
-          <w:bCs w:val="false"/>
-          <w:i w:val="false"/>
-          <w:iCs w:val="false"/>
-          <w:sz w:val="18"/>
-          <w:szCs w:val="18"/>
-        </w:rPr>
-        <w:t xml:space="preserve"> |   v         |                        |      |       +-----+-----+  |</w:t>
-      </w:r>
-    </w:p>
-    <w:p>
-      <w:pPr>
-        <w:shd w:fill="F2F2F2" w:val="clear"/>
-        <w:spacing w:after="0" w:line="230"/>
-      </w:pPr>
-      <w:r>
-        <w:rPr>
-          <w:rFonts w:ascii="Courier New" w:cs="Courier New" w:eastAsia="Courier New" w:hAnsi="Courier New"/>
-          <w:b w:val="false"/>
-          <w:bCs w:val="false"/>
-          <w:i w:val="false"/>
-          <w:iCs w:val="false"/>
-          <w:sz w:val="18"/>
-          <w:szCs w:val="18"/>
-        </w:rPr>
-        <w:t xml:space="preserve"> | uygulama.bin|                        |  16KB BRAM   GPIO    UART   |</w:t>
-      </w:r>
-    </w:p>
-    <w:p>
-      <w:pPr>
-        <w:shd w:fill="F2F2F2" w:val="clear"/>
-        <w:spacing w:after="0" w:line="230"/>
-      </w:pPr>
-      <w:r>
-        <w:rPr>
-          <w:rFonts w:ascii="Courier New" w:cs="Courier New" w:eastAsia="Courier New" w:hAnsi="Courier New"/>
-          <w:b w:val="false"/>
-          <w:bCs w:val="false"/>
-          <w:i w:val="false"/>
-          <w:iCs w:val="false"/>
-          <w:sz w:val="18"/>
-          <w:szCs w:val="18"/>
-        </w:rPr>
-        <w:t xml:space="preserve"> |   |         |   USB-UART (BL702)     |  +loader@0x0 (LED+  (0x2000_|</w:t>
-      </w:r>
-    </w:p>
-    <w:p>
-      <w:pPr>
-        <w:shd w:fill="F2F2F2" w:val="clear"/>
-        <w:spacing w:after="0" w:line="230"/>
-      </w:pPr>
-      <w:r>
-        <w:rPr>
-          <w:rFonts w:ascii="Courier New" w:cs="Courier New" w:eastAsia="Courier New" w:hAnsi="Courier New"/>
-          <w:b w:val="false"/>
-          <w:bCs w:val="false"/>
-          <w:i w:val="false"/>
-          <w:iCs w:val="false"/>
-          <w:sz w:val="18"/>
-          <w:szCs w:val="18"/>
-        </w:rPr>
-        <w:t xml:space="preserve"> | host_loader +======seri port=======&gt;|  +app  @0x3000 buton) 0000) |</w:t>
-      </w:r>
-    </w:p>
-    <w:p>
-      <w:pPr>
-        <w:shd w:fill="F2F2F2" w:val="clear"/>
-        <w:spacing w:after="0" w:line="230"/>
-      </w:pPr>
-      <w:r>
-        <w:rPr>
-          <w:rFonts w:ascii="Courier New" w:cs="Courier New" w:eastAsia="Courier New" w:hAnsi="Courier New"/>
-          <w:b w:val="false"/>
-          <w:bCs w:val="false"/>
-          <w:i w:val="false"/>
-          <w:iCs w:val="false"/>
-          <w:sz w:val="18"/>
-          <w:szCs w:val="18"/>
-        </w:rPr>
-        <w:t xml:space="preserve"> | (paket+CRC) |   AA55|CMD|LEN|ADDR|   |      ^                ^     |</w:t>
-      </w:r>
-    </w:p>
-    <w:p>
-      <w:pPr>
-        <w:shd w:fill="F2F2F2" w:val="clear"/>
-        <w:spacing w:after="0" w:line="230"/>
-      </w:pPr>
-      <w:r>
-        <w:rPr>
-          <w:rFonts w:ascii="Courier New" w:cs="Courier New" w:eastAsia="Courier New" w:hAnsi="Courier New"/>
-          <w:b w:val="false"/>
-          <w:bCs w:val="false"/>
-          <w:i w:val="false"/>
-          <w:iCs w:val="false"/>
-          <w:sz w:val="18"/>
-          <w:szCs w:val="18"/>
-        </w:rPr>
-        <w:t xml:space="preserve"> |             |&lt;-----ACK / NAK---------|  loader (RV32I) &lt;------+    |</w:t>
-      </w:r>
-    </w:p>
-    <w:p>
-      <w:pPr>
-        <w:shd w:fill="F2F2F2" w:val="clear"/>
-        <w:spacing w:after="0" w:line="230"/>
-      </w:pPr>
-      <w:r>
-        <w:rPr>
-          <w:rFonts w:ascii="Courier New" w:cs="Courier New" w:eastAsia="Courier New" w:hAnsi="Courier New"/>
-          <w:b w:val="false"/>
-          <w:bCs w:val="false"/>
-          <w:i w:val="false"/>
-          <w:iCs w:val="false"/>
-          <w:sz w:val="18"/>
-          <w:szCs w:val="18"/>
-        </w:rPr>
-        <w:t xml:space="preserve"> +-------------+   DATA|CRC16           +-----------------------------+</w:t>
+        <w:spacing w:after="40" w:before="80"/>
+        <w:jc w:val="center"/>
+      </w:pPr>
+      <w:r>
+        <w:drawing>
+          <wp:inline distT="0" distB="0" distL="0" distR="0">
+            <wp:extent cx="5943600" cy="2943225"/>
+            <wp:effectExtent t="0" r="0" b="0" l="0"/>
+            <wp:docPr id="1" name="fig_arch.png" descr="Şekil 2.1. Uçtan uca sistem mimarisi ve veri akışı." title="Şekil 2.1. Uçtan uca sistem mimarisi ve veri akışı."/>
+            <wp:cNvGraphicFramePr>
+              <a:graphicFrameLocks xmlns:a="http://schemas.openxmlformats.org/drawingml/2006/main" noChangeAspect="1"/>
+            </wp:cNvGraphicFramePr>
+            <a:graphic xmlns:a="http://schemas.openxmlformats.org/drawingml/2006/main">
+              <a:graphicData uri="http://schemas.openxmlformats.org/drawingml/2006/picture">
+                <pic:pic xmlns:pic="http://schemas.openxmlformats.org/drawingml/2006/picture">
+                  <pic:nvPicPr>
+                    <pic:cNvPr id="0" name="" descr=""/>
+                    <pic:cNvPicPr>
+                      <a:picLocks noChangeAspect="1" noChangeArrowheads="1"/>
+                    </pic:cNvPicPr>
+                  </pic:nvPicPr>
+                  <pic:blipFill>
+                    <a:blip r:embed="rId8" cstate="none"/>
+                    <a:srcRect/>
+                    <a:stretch>
+                      <a:fillRect/>
+                    </a:stretch>
+                  </pic:blipFill>
+                  <pic:spPr bwMode="auto">
+                    <a:xfrm>
+                      <a:off x="0" y="0"/>
+                      <a:ext cx="5943600" cy="2943225"/>
+                    </a:xfrm>
+                    <a:prstGeom prst="rect">
+                      <a:avLst/>
+                    </a:prstGeom>
+                  </pic:spPr>
+                </pic:pic>
+              </a:graphicData>
+            </a:graphic>
+          </wp:inline>
+        </w:drawing>
       </w:r>
     </w:p>
     <w:p>
@@ -1749,110 +1597,48 @@
     </w:p>
     <w:p>
       <w:pPr>
-        <w:shd w:fill="F2F2F2" w:val="clear"/>
-        <w:spacing w:after="0" w:line="230"/>
-      </w:pPr>
-      <w:r>
-        <w:rPr>
-          <w:rFonts w:ascii="Courier New" w:cs="Courier New" w:eastAsia="Courier New" w:hAnsi="Courier New"/>
-          <w:b w:val="false"/>
-          <w:bCs w:val="false"/>
-          <w:i w:val="false"/>
-          <w:iCs w:val="false"/>
-          <w:sz w:val="18"/>
-          <w:szCs w:val="18"/>
-        </w:rPr>
-        <w:t xml:space="preserve">  +-------+-----+-----+-----------+-----------+--------+</w:t>
-      </w:r>
-    </w:p>
-    <w:p>
-      <w:pPr>
-        <w:shd w:fill="F2F2F2" w:val="clear"/>
-        <w:spacing w:after="0" w:line="230"/>
-      </w:pPr>
-      <w:r>
-        <w:rPr>
-          <w:rFonts w:ascii="Courier New" w:cs="Courier New" w:eastAsia="Courier New" w:hAnsi="Courier New"/>
-          <w:b w:val="false"/>
-          <w:bCs w:val="false"/>
-          <w:i w:val="false"/>
-          <w:iCs w:val="false"/>
-          <w:sz w:val="18"/>
-          <w:szCs w:val="18"/>
-        </w:rPr>
-        <w:t xml:space="preserve">  | SYNC  | CMD | LEN |   ADDR    |   DATA    | CRC16  |</w:t>
-      </w:r>
-    </w:p>
-    <w:p>
-      <w:pPr>
-        <w:shd w:fill="F2F2F2" w:val="clear"/>
-        <w:spacing w:after="0" w:line="230"/>
-      </w:pPr>
-      <w:r>
-        <w:rPr>
-          <w:rFonts w:ascii="Courier New" w:cs="Courier New" w:eastAsia="Courier New" w:hAnsi="Courier New"/>
-          <w:b w:val="false"/>
-          <w:bCs w:val="false"/>
-          <w:i w:val="false"/>
-          <w:iCs w:val="false"/>
-          <w:sz w:val="18"/>
-          <w:szCs w:val="18"/>
-        </w:rPr>
-        <w:t xml:space="preserve">  | AA 55 | 1B  | 1B  |  4B (LE)  |  LEN bayt |  2B LE |</w:t>
-      </w:r>
-    </w:p>
-    <w:p>
-      <w:pPr>
-        <w:shd w:fill="F2F2F2" w:val="clear"/>
-        <w:spacing w:after="0" w:line="230"/>
-      </w:pPr>
-      <w:r>
-        <w:rPr>
-          <w:rFonts w:ascii="Courier New" w:cs="Courier New" w:eastAsia="Courier New" w:hAnsi="Courier New"/>
-          <w:b w:val="false"/>
-          <w:bCs w:val="false"/>
-          <w:i w:val="false"/>
-          <w:iCs w:val="false"/>
-          <w:sz w:val="18"/>
-          <w:szCs w:val="18"/>
-        </w:rPr>
-        <w:t xml:space="preserve">  +-------+-----+-----+-----------+-----------+--------+</w:t>
-      </w:r>
-    </w:p>
-    <w:p>
-      <w:pPr>
-        <w:shd w:fill="F2F2F2" w:val="clear"/>
-        <w:spacing w:after="0" w:line="230"/>
-      </w:pPr>
-      <w:r>
-        <w:rPr>
-          <w:rFonts w:ascii="Courier New" w:cs="Courier New" w:eastAsia="Courier New" w:hAnsi="Courier New"/>
-          <w:b w:val="false"/>
-          <w:bCs w:val="false"/>
-          <w:i w:val="false"/>
-          <w:iCs w:val="false"/>
-          <w:sz w:val="18"/>
-          <w:szCs w:val="18"/>
-        </w:rPr>
-        <w:t xml:space="preserve">  CMD: 0x01=WRITE_BLOCK  0x02=START(jump)  0x03=PING</w:t>
-      </w:r>
-    </w:p>
-    <w:p>
-      <w:pPr>
-        <w:shd w:fill="F2F2F2" w:val="clear"/>
-        <w:spacing w:after="0" w:line="230"/>
-      </w:pPr>
-      <w:r>
-        <w:rPr>
-          <w:rFonts w:ascii="Courier New" w:cs="Courier New" w:eastAsia="Courier New" w:hAnsi="Courier New"/>
-          <w:b w:val="false"/>
-          <w:bCs w:val="false"/>
-          <w:i w:val="false"/>
-          <w:iCs w:val="false"/>
-          <w:sz w:val="18"/>
-          <w:szCs w:val="18"/>
-        </w:rPr>
-        <w:t xml:space="preserve">  Yanit: 0x06=ACK  0x15=NAK</w:t>
+        <w:spacing w:after="40" w:before="80"/>
+        <w:jc w:val="center"/>
+      </w:pPr>
+      <w:r>
+        <w:drawing>
+          <wp:inline distT="0" distB="0" distL="0" distR="0">
+            <wp:extent cx="5943600" cy="1323975"/>
+            <wp:effectExtent t="0" r="0" b="0" l="0"/>
+            <wp:docPr id="1" name="fig_packet.png" descr="Şekil 2.2. Host–loader paket çerçevesi (CMD: 0x01=WRITE_BLOCK, 0x02=START, 0x03=PING; yanıt 0x06=ACK / 0x15=NAK)." title="Şekil 2.2. Host–loader paket çerçevesi (CMD: 0x01=WRITE_BLOCK, 0x02=START, 0x03=PING; yanıt 0x06=ACK / 0x15=NAK)."/>
+            <wp:cNvGraphicFramePr>
+              <a:graphicFrameLocks xmlns:a="http://schemas.openxmlformats.org/drawingml/2006/main" noChangeAspect="1"/>
+            </wp:cNvGraphicFramePr>
+            <a:graphic xmlns:a="http://schemas.openxmlformats.org/drawingml/2006/main">
+              <a:graphicData uri="http://schemas.openxmlformats.org/drawingml/2006/picture">
+                <pic:pic xmlns:pic="http://schemas.openxmlformats.org/drawingml/2006/picture">
+                  <pic:nvPicPr>
+                    <pic:cNvPr id="0" name="" descr=""/>
+                    <pic:cNvPicPr>
+                      <a:picLocks noChangeAspect="1" noChangeArrowheads="1"/>
+                    </pic:cNvPicPr>
+                  </pic:nvPicPr>
+                  <pic:blipFill>
+                    <a:blip r:embed="rId9" cstate="none"/>
+                    <a:srcRect/>
+                    <a:stretch>
+                      <a:fillRect/>
+                    </a:stretch>
+                  </pic:blipFill>
+                  <pic:spPr bwMode="auto">
+                    <a:xfrm>
+                      <a:off x="0" y="0"/>
+                      <a:ext cx="5943600" cy="1323975"/>
+                    </a:xfrm>
+                    <a:prstGeom prst="rect">
+                      <a:avLst/>
+                    </a:prstGeom>
+                  </pic:spPr>
+                </pic:pic>
+              </a:graphicData>
+            </a:graphic>
+          </wp:inline>
+        </w:drawing>
       </w:r>
     </w:p>
     <w:p>
@@ -1871,7 +1657,7 @@
           <w:sz w:val="18"/>
           <w:szCs w:val="18"/>
         </w:rPr>
-        <w:t xml:space="preserve">Tablo 2.1 / Şekil 2.2. Host–loader paket çerçevesi.</w:t>
+        <w:t xml:space="preserve">Şekil 2.2. Host–loader paket çerçevesi (CMD: 0x01=WRITE_BLOCK, 0x02=START, 0x03=PING; yanıt 0x06=ACK / 0x15=NAK).</w:t>
       </w:r>
     </w:p>
     <w:p>
@@ -2503,290 +2289,48 @@
     </w:p>
     <w:p>
       <w:pPr>
-        <w:shd w:fill="F2F2F2" w:val="clear"/>
-        <w:spacing w:after="0" w:line="230"/>
-      </w:pPr>
-      <w:r>
-        <w:rPr>
-          <w:rFonts w:ascii="Courier New" w:cs="Courier New" w:eastAsia="Courier New" w:hAnsi="Courier New"/>
-          <w:b w:val="false"/>
-          <w:bCs w:val="false"/>
-          <w:i w:val="false"/>
-          <w:iCs w:val="false"/>
-          <w:sz w:val="18"/>
-          <w:szCs w:val="18"/>
-        </w:rPr>
-        <w:t xml:space="preserve">        +-------+   AA 55      +--------+  CMD,LEN,ADDR(4)</w:t>
-      </w:r>
-    </w:p>
-    <w:p>
-      <w:pPr>
-        <w:shd w:fill="F2F2F2" w:val="clear"/>
-        <w:spacing w:after="0" w:line="230"/>
-      </w:pPr>
-      <w:r>
-        <w:rPr>
-          <w:rFonts w:ascii="Courier New" w:cs="Courier New" w:eastAsia="Courier New" w:hAnsi="Courier New"/>
-          <w:b w:val="false"/>
-          <w:bCs w:val="false"/>
-          <w:i w:val="false"/>
-          <w:iCs w:val="false"/>
-          <w:sz w:val="18"/>
-          <w:szCs w:val="18"/>
-        </w:rPr>
-        <w:t xml:space="preserve">        | IDLE  +-------------&gt;| HEADER +-----------------+</w:t>
-      </w:r>
-    </w:p>
-    <w:p>
-      <w:pPr>
-        <w:shd w:fill="F2F2F2" w:val="clear"/>
-        <w:spacing w:after="0" w:line="230"/>
-      </w:pPr>
-      <w:r>
-        <w:rPr>
-          <w:rFonts w:ascii="Courier New" w:cs="Courier New" w:eastAsia="Courier New" w:hAnsi="Courier New"/>
-          <w:b w:val="false"/>
-          <w:bCs w:val="false"/>
-          <w:i w:val="false"/>
-          <w:iCs w:val="false"/>
-          <w:sz w:val="18"/>
-          <w:szCs w:val="18"/>
-        </w:rPr>
-        <w:t xml:space="preserve">        +---^---+  (SYNC)      +--------+                 |</w:t>
-      </w:r>
-    </w:p>
-    <w:p>
-      <w:pPr>
-        <w:shd w:fill="F2F2F2" w:val="clear"/>
-        <w:spacing w:after="0" w:line="230"/>
-      </w:pPr>
-      <w:r>
-        <w:rPr>
-          <w:rFonts w:ascii="Courier New" w:cs="Courier New" w:eastAsia="Courier New" w:hAnsi="Courier New"/>
-          <w:b w:val="false"/>
-          <w:bCs w:val="false"/>
-          <w:i w:val="false"/>
-          <w:iCs w:val="false"/>
-          <w:sz w:val="18"/>
-          <w:szCs w:val="18"/>
-        </w:rPr>
-        <w:t xml:space="preserve">            |                                             v</w:t>
-      </w:r>
-    </w:p>
-    <w:p>
-      <w:pPr>
-        <w:shd w:fill="F2F2F2" w:val="clear"/>
-        <w:spacing w:after="0" w:line="230"/>
-      </w:pPr>
-      <w:r>
-        <w:rPr>
-          <w:rFonts w:ascii="Courier New" w:cs="Courier New" w:eastAsia="Courier New" w:hAnsi="Courier New"/>
-          <w:b w:val="false"/>
-          <w:bCs w:val="false"/>
-          <w:i w:val="false"/>
-          <w:iCs w:val="false"/>
-          <w:sz w:val="18"/>
-          <w:szCs w:val="18"/>
-        </w:rPr>
-        <w:t xml:space="preserve">            |          +------+   LEN bayt -&gt; RAM    +--------+</w:t>
-      </w:r>
-    </w:p>
-    <w:p>
-      <w:pPr>
-        <w:shd w:fill="F2F2F2" w:val="clear"/>
-        <w:spacing w:after="0" w:line="230"/>
-      </w:pPr>
-      <w:r>
-        <w:rPr>
-          <w:rFonts w:ascii="Courier New" w:cs="Courier New" w:eastAsia="Courier New" w:hAnsi="Courier New"/>
-          <w:b w:val="false"/>
-          <w:bCs w:val="false"/>
-          <w:i w:val="false"/>
-          <w:iCs w:val="false"/>
-          <w:sz w:val="18"/>
-          <w:szCs w:val="18"/>
-        </w:rPr>
-        <w:t xml:space="preserve">   ACK/NAK  |          | DATA |&lt;---------------------+ (oku)  |</w:t>
-      </w:r>
-    </w:p>
-    <w:p>
-      <w:pPr>
-        <w:shd w:fill="F2F2F2" w:val="clear"/>
-        <w:spacing w:after="0" w:line="230"/>
-      </w:pPr>
-      <w:r>
-        <w:rPr>
-          <w:rFonts w:ascii="Courier New" w:cs="Courier New" w:eastAsia="Courier New" w:hAnsi="Courier New"/>
-          <w:b w:val="false"/>
-          <w:bCs w:val="false"/>
-          <w:i w:val="false"/>
-          <w:iCs w:val="false"/>
-          <w:sz w:val="18"/>
-          <w:szCs w:val="18"/>
-        </w:rPr>
-        <w:t xml:space="preserve">            |          +---+--+   (her bayt CRC'ye)  +--------+</w:t>
-      </w:r>
-    </w:p>
-    <w:p>
-      <w:pPr>
-        <w:shd w:fill="F2F2F2" w:val="clear"/>
-        <w:spacing w:after="0" w:line="230"/>
-      </w:pPr>
-      <w:r>
-        <w:rPr>
-          <w:rFonts w:ascii="Courier New" w:cs="Courier New" w:eastAsia="Courier New" w:hAnsi="Courier New"/>
-          <w:b w:val="false"/>
-          <w:bCs w:val="false"/>
-          <w:i w:val="false"/>
-          <w:iCs w:val="false"/>
-          <w:sz w:val="18"/>
-          <w:szCs w:val="18"/>
-        </w:rPr>
-        <w:t xml:space="preserve">            |              |</w:t>
-      </w:r>
-    </w:p>
-    <w:p>
-      <w:pPr>
-        <w:shd w:fill="F2F2F2" w:val="clear"/>
-        <w:spacing w:after="0" w:line="230"/>
-      </w:pPr>
-      <w:r>
-        <w:rPr>
-          <w:rFonts w:ascii="Courier New" w:cs="Courier New" w:eastAsia="Courier New" w:hAnsi="Courier New"/>
-          <w:b w:val="false"/>
-          <w:bCs w:val="false"/>
-          <w:i w:val="false"/>
-          <w:iCs w:val="false"/>
-          <w:sz w:val="18"/>
-          <w:szCs w:val="18"/>
-        </w:rPr>
-        <w:t xml:space="preserve">        +---+----+   CRC16 v   +-----+  eslesme?  +-----------+</w:t>
-      </w:r>
-    </w:p>
-    <w:p>
-      <w:pPr>
-        <w:shd w:fill="F2F2F2" w:val="clear"/>
-        <w:spacing w:after="0" w:line="230"/>
-      </w:pPr>
-      <w:r>
-        <w:rPr>
-          <w:rFonts w:ascii="Courier New" w:cs="Courier New" w:eastAsia="Courier New" w:hAnsi="Courier New"/>
-          <w:b w:val="false"/>
-          <w:bCs w:val="false"/>
-          <w:i w:val="false"/>
-          <w:iCs w:val="false"/>
-          <w:sz w:val="18"/>
-          <w:szCs w:val="18"/>
-        </w:rPr>
-        <w:t xml:space="preserve">        | ACK/NAK|&lt;------------+ CRC +-----------&gt;| START?    |</w:t>
-      </w:r>
-    </w:p>
-    <w:p>
-      <w:pPr>
-        <w:shd w:fill="F2F2F2" w:val="clear"/>
-        <w:spacing w:after="0" w:line="230"/>
-      </w:pPr>
-      <w:r>
-        <w:rPr>
-          <w:rFonts w:ascii="Courier New" w:cs="Courier New" w:eastAsia="Courier New" w:hAnsi="Courier New"/>
-          <w:b w:val="false"/>
-          <w:bCs w:val="false"/>
-          <w:i w:val="false"/>
-          <w:iCs w:val="false"/>
-          <w:sz w:val="18"/>
-          <w:szCs w:val="18"/>
-        </w:rPr>
-        <w:t xml:space="preserve">        +--------+   karsilastir+-----+   evet     +-----+-----+</w:t>
-      </w:r>
-    </w:p>
-    <w:p>
-      <w:pPr>
-        <w:shd w:fill="F2F2F2" w:val="clear"/>
-        <w:spacing w:after="0" w:line="230"/>
-      </w:pPr>
-      <w:r>
-        <w:rPr>
-          <w:rFonts w:ascii="Courier New" w:cs="Courier New" w:eastAsia="Courier New" w:hAnsi="Courier New"/>
-          <w:b w:val="false"/>
-          <w:bCs w:val="false"/>
-          <w:i w:val="false"/>
-          <w:iCs w:val="false"/>
-          <w:sz w:val="18"/>
-          <w:szCs w:val="18"/>
-        </w:rPr>
-        <w:t xml:space="preserve">                                                        | START</w:t>
-      </w:r>
-    </w:p>
-    <w:p>
-      <w:pPr>
-        <w:shd w:fill="F2F2F2" w:val="clear"/>
-        <w:spacing w:after="0" w:line="230"/>
-      </w:pPr>
-      <w:r>
-        <w:rPr>
-          <w:rFonts w:ascii="Courier New" w:cs="Courier New" w:eastAsia="Courier New" w:hAnsi="Courier New"/>
-          <w:b w:val="false"/>
-          <w:bCs w:val="false"/>
-          <w:i w:val="false"/>
-          <w:iCs w:val="false"/>
-          <w:sz w:val="18"/>
-          <w:szCs w:val="18"/>
-        </w:rPr>
-        <w:t xml:space="preserve">                                                        v</w:t>
-      </w:r>
-    </w:p>
-    <w:p>
-      <w:pPr>
-        <w:shd w:fill="F2F2F2" w:val="clear"/>
-        <w:spacing w:after="0" w:line="230"/>
-      </w:pPr>
-      <w:r>
-        <w:rPr>
-          <w:rFonts w:ascii="Courier New" w:cs="Courier New" w:eastAsia="Courier New" w:hAnsi="Courier New"/>
-          <w:b w:val="false"/>
-          <w:bCs w:val="false"/>
-          <w:i w:val="false"/>
-          <w:iCs w:val="false"/>
-          <w:sz w:val="18"/>
-          <w:szCs w:val="18"/>
-        </w:rPr>
-        <w:t xml:space="preserve">                                                  +-----------+</w:t>
-      </w:r>
-    </w:p>
-    <w:p>
-      <w:pPr>
-        <w:shd w:fill="F2F2F2" w:val="clear"/>
-        <w:spacing w:after="0" w:line="230"/>
-      </w:pPr>
-      <w:r>
-        <w:rPr>
-          <w:rFonts w:ascii="Courier New" w:cs="Courier New" w:eastAsia="Courier New" w:hAnsi="Courier New"/>
-          <w:b w:val="false"/>
-          <w:bCs w:val="false"/>
-          <w:i w:val="false"/>
-          <w:iCs w:val="false"/>
-          <w:sz w:val="18"/>
-          <w:szCs w:val="18"/>
-        </w:rPr>
-        <w:t xml:space="preserve">                                                  | JUMP 0x3000|</w:t>
-      </w:r>
-    </w:p>
-    <w:p>
-      <w:pPr>
-        <w:shd w:fill="F2F2F2" w:val="clear"/>
-        <w:spacing w:after="0" w:line="230"/>
-      </w:pPr>
-      <w:r>
-        <w:rPr>
-          <w:rFonts w:ascii="Courier New" w:cs="Courier New" w:eastAsia="Courier New" w:hAnsi="Courier New"/>
-          <w:b w:val="false"/>
-          <w:bCs w:val="false"/>
-          <w:i w:val="false"/>
-          <w:iCs w:val="false"/>
-          <w:sz w:val="18"/>
-          <w:szCs w:val="18"/>
-        </w:rPr>
-        <w:t xml:space="preserve">                                                  +-----------+</w:t>
+        <w:spacing w:after="40" w:before="80"/>
+        <w:jc w:val="center"/>
+      </w:pPr>
+      <w:r>
+        <w:drawing>
+          <wp:inline distT="0" distB="0" distL="0" distR="0">
+            <wp:extent cx="5715000" cy="3200400"/>
+            <wp:effectExtent t="0" r="0" b="0" l="0"/>
+            <wp:docPr id="1" name="fig_fsm.png" descr="Şekil 2.3. Loader sonlu durum makinesi (FSM)." title="Şekil 2.3. Loader sonlu durum makinesi (FSM)."/>
+            <wp:cNvGraphicFramePr>
+              <a:graphicFrameLocks xmlns:a="http://schemas.openxmlformats.org/drawingml/2006/main" noChangeAspect="1"/>
+            </wp:cNvGraphicFramePr>
+            <a:graphic xmlns:a="http://schemas.openxmlformats.org/drawingml/2006/main">
+              <a:graphicData uri="http://schemas.openxmlformats.org/drawingml/2006/picture">
+                <pic:pic xmlns:pic="http://schemas.openxmlformats.org/drawingml/2006/picture">
+                  <pic:nvPicPr>
+                    <pic:cNvPr id="0" name="" descr=""/>
+                    <pic:cNvPicPr>
+                      <a:picLocks noChangeAspect="1" noChangeArrowheads="1"/>
+                    </pic:cNvPicPr>
+                  </pic:nvPicPr>
+                  <pic:blipFill>
+                    <a:blip r:embed="rId10" cstate="none"/>
+                    <a:srcRect/>
+                    <a:stretch>
+                      <a:fillRect/>
+                    </a:stretch>
+                  </pic:blipFill>
+                  <pic:spPr bwMode="auto">
+                    <a:xfrm>
+                      <a:off x="0" y="0"/>
+                      <a:ext cx="5715000" cy="3200400"/>
+                    </a:xfrm>
+                    <a:prstGeom prst="rect">
+                      <a:avLst/>
+                    </a:prstGeom>
+                  </pic:spPr>
+                </pic:pic>
+              </a:graphicData>
+            </a:graphic>
+          </wp:inline>
+        </w:drawing>
       </w:r>
     </w:p>
     <w:p>
@@ -8120,6 +7664,88 @@
           <w:szCs w:val="18"/>
         </w:rPr>
         <w:t xml:space="preserve">Tablo 5.1. RACI sorumluluk matrisi (takımca doldurulacak).</w:t>
+      </w:r>
+    </w:p>
+    <w:p>
+      <w:pPr>
+        <w:spacing w:after="120" w:before="0" w:line="264"/>
+      </w:pPr>
+      <w:r>
+        <w:rPr>
+          <w:rFonts w:ascii="Courier New" w:cs="Courier New" w:eastAsia="Courier New" w:hAnsi="Courier New"/>
+          <w:b w:val="false"/>
+          <w:bCs w:val="false"/>
+          <w:i w:val="false"/>
+          <w:iCs w:val="false"/>
+          <w:sz w:val="20"/>
+          <w:szCs w:val="20"/>
+        </w:rPr>
+        <w:t xml:space="preserve">Projenin fazlı zaman çizelgesi Şekil 5.1'de verilmiştir; donanım fazları (UART/SoC ve loader) öne alınarak entegrasyon riski erken yönetilmiştir (PÇ13).</w:t>
+      </w:r>
+    </w:p>
+    <w:p>
+      <w:pPr>
+        <w:spacing w:after="40" w:before="80"/>
+        <w:jc w:val="center"/>
+      </w:pPr>
+      <w:r>
+        <w:drawing>
+          <wp:inline distT="0" distB="0" distL="0" distR="0">
+            <wp:extent cx="5715000" cy="2447925"/>
+            <wp:effectExtent t="0" r="0" b="0" l="0"/>
+            <wp:docPr id="1" name="fig_gantt.png" descr="Şekil 5.1. Proje 3 fazlı zaman çizelgesi (Gantt)." title="Şekil 5.1. Proje 3 fazlı zaman çizelgesi (Gantt)."/>
+            <wp:cNvGraphicFramePr>
+              <a:graphicFrameLocks xmlns:a="http://schemas.openxmlformats.org/drawingml/2006/main" noChangeAspect="1"/>
+            </wp:cNvGraphicFramePr>
+            <a:graphic xmlns:a="http://schemas.openxmlformats.org/drawingml/2006/main">
+              <a:graphicData uri="http://schemas.openxmlformats.org/drawingml/2006/picture">
+                <pic:pic xmlns:pic="http://schemas.openxmlformats.org/drawingml/2006/picture">
+                  <pic:nvPicPr>
+                    <pic:cNvPr id="0" name="" descr=""/>
+                    <pic:cNvPicPr>
+                      <a:picLocks noChangeAspect="1" noChangeArrowheads="1"/>
+                    </pic:cNvPicPr>
+                  </pic:nvPicPr>
+                  <pic:blipFill>
+                    <a:blip r:embed="rId11" cstate="none"/>
+                    <a:srcRect/>
+                    <a:stretch>
+                      <a:fillRect/>
+                    </a:stretch>
+                  </pic:blipFill>
+                  <pic:spPr bwMode="auto">
+                    <a:xfrm>
+                      <a:off x="0" y="0"/>
+                      <a:ext cx="5715000" cy="2447925"/>
+                    </a:xfrm>
+                    <a:prstGeom prst="rect">
+                      <a:avLst/>
+                    </a:prstGeom>
+                  </pic:spPr>
+                </pic:pic>
+              </a:graphicData>
+            </a:graphic>
+          </wp:inline>
+        </w:drawing>
+      </w:r>
+    </w:p>
+    <w:p>
+      <w:pPr>
+        <w:spacing w:after="160" w:before="0" w:line="264"/>
+        <w:jc w:val="center"/>
+      </w:pPr>
+      <w:r>
+        <w:rPr>
+          <w:rFonts w:ascii="Courier New" w:cs="Courier New" w:eastAsia="Courier New" w:hAnsi="Courier New"/>
+          <w:b w:val="false"/>
+          <w:bCs w:val="false"/>
+          <w:i/>
+          <w:iCs/>
+          <w:color w:val="595959"/>
+          <w:sz w:val="18"/>
+          <w:szCs w:val="18"/>
+        </w:rPr>
+        <w:t xml:space="preserve">Şekil 5.1. Proje 3 fazlı zaman çizelgesi (Gantt).</w:t>
       </w:r>
     </w:p>
     <w:p>

</xml_diff>

<commit_message>
Proje 3 rapor: detayli mimari + FSM diyagramlari, draw.io kaynak dahil
- docs/report/drawio/fig_arch.drawio : detayli sistem mimarisi (draw.io editable)
  toolchain (assembler/linker/hex_emitter/host_loader) + seri paket + tam SoC
  (BL702, uart.v, PicoRV32, adres cozucu, BRAM 16KB, gpio, LED/buton/reset/clk),
  adres etiketleri ve pin numaralariyla. 22 kutu, 17 ok.
- docs/report/drawio/fig_fsm.drawio : detayli loader FSM (draw.io editable)
  karar elmaslari (0xAA/0x55/i<LEN/crc/START), DATA dongusu, NAK/ACK/JUMP,
  leaf altprogram + register notu. 18 kutu, 20 ok.
- generate_figures.py: fig_arch ve fig_fsm matplotlib surumleri ayni detaya
  yukseltildi (rapor PNG'leri). build_report.js gomme boyutlari oran-dogru.
- BIL302_PROJE3.docx yeniden uretildi.

Kullanici draw.io'da .drawio'yu duzenleyip PNG export ederek img/ altindakileri
degistirebilir; sonra build_report.js yeniden calistirilir.

Co-Authored-By: Claude Opus 4.8 <noreply@anthropic.com>
</commit_message>
<xml_diff>
--- a/assembler_1/assembler_1/docs/report/BIL302_PROJE3.docx
+++ b/assembler_1/assembler_1/docs/report/BIL302_PROJE3.docx
@@ -1486,9 +1486,9 @@
       <w:r>
         <w:drawing>
           <wp:inline distT="0" distB="0" distL="0" distR="0">
-            <wp:extent cx="5943600" cy="2943225"/>
+            <wp:extent cx="5943600" cy="3619500"/>
             <wp:effectExtent t="0" r="0" b="0" l="0"/>
-            <wp:docPr id="1" name="fig_arch.png" descr="Şekil 2.1. Uçtan uca sistem mimarisi ve veri akışı." title="Şekil 2.1. Uçtan uca sistem mimarisi ve veri akışı."/>
+            <wp:docPr id="1" name="fig_arch.png" descr="Şekil 2.1. Uçtan uca sistem mimarisi ve veri akışı (Co-Design)." title="Şekil 2.1. Uçtan uca sistem mimarisi ve veri akışı (Co-Design)."/>
             <wp:cNvGraphicFramePr>
               <a:graphicFrameLocks xmlns:a="http://schemas.openxmlformats.org/drawingml/2006/main" noChangeAspect="1"/>
             </wp:cNvGraphicFramePr>
@@ -1511,7 +1511,7 @@
                   <pic:spPr bwMode="auto">
                     <a:xfrm>
                       <a:off x="0" y="0"/>
-                      <a:ext cx="5943600" cy="2943225"/>
+                      <a:ext cx="5943600" cy="3619500"/>
                     </a:xfrm>
                     <a:prstGeom prst="rect">
                       <a:avLst/>
@@ -1540,7 +1540,7 @@
           <w:sz w:val="18"/>
           <w:szCs w:val="18"/>
         </w:rPr>
-        <w:t xml:space="preserve">Şekil 2.1. Uçtan uca sistem mimarisi ve veri akışı.</w:t>
+        <w:t xml:space="preserve">Şekil 2.1. Uçtan uca sistem mimarisi ve veri akışı (Co-Design).</w:t>
       </w:r>
     </w:p>
     <w:p>
@@ -2295,7 +2295,7 @@
       <w:r>
         <w:drawing>
           <wp:inline distT="0" distB="0" distL="0" distR="0">
-            <wp:extent cx="5715000" cy="3200400"/>
+            <wp:extent cx="4286250" cy="4914900"/>
             <wp:effectExtent t="0" r="0" b="0" l="0"/>
             <wp:docPr id="1" name="fig_fsm.png" descr="Şekil 2.3. Loader sonlu durum makinesi (FSM)." title="Şekil 2.3. Loader sonlu durum makinesi (FSM)."/>
             <wp:cNvGraphicFramePr>
@@ -2320,7 +2320,7 @@
                   <pic:spPr bwMode="auto">
                     <a:xfrm>
                       <a:off x="0" y="0"/>
-                      <a:ext cx="5715000" cy="3200400"/>
+                      <a:ext cx="4286250" cy="4914900"/>
                     </a:xfrm>
                     <a:prstGeom prst="rect">
                       <a:avLst/>

</xml_diff>

<commit_message>
Proje 3 rapor: 115200 baud notu eklendi (sentez-zamani parametre)
Gercek donanim olcumleri 9600 baud icin verildi. 115200'de host calistirildi
ama FPGA UART baud'u sentez zamani sabit parametre (soc_top.v UART_BAUD,
uart.v DIV=CLK_FREQ/BAUD) ve bitstream 9600'e gore uretildiginden hiz uyumsuzlugu
olustu -> ACK alinamadi -> yukleme tamamlanamadi. 115200 icin UART_BAUD=115200
yapip yeniden sentez+bitstream gerekir.

- build_report.js: Tablo 3.3'te 115200 sutunu "tamamlanamadi*", altina aciklayici
  not; analiz paragrafi teorik-kazanc olarak netlestirildi.
- PROJE3.md §16: ayni not eklendi.
- BIL302_PROJE3.docx yeniden uretildi.

Co-Authored-By: Claude Opus 4.8 <noreply@anthropic.com>
</commit_message>
<xml_diff>
--- a/assembler_1/assembler_1/docs/report/BIL302_PROJE3.docx
+++ b/assembler_1/assembler_1/docs/report/BIL302_PROJE3.docx
@@ -5737,7 +5737,7 @@
           <w:sz w:val="20"/>
           <w:szCs w:val="20"/>
         </w:rPr>
-        <w:t xml:space="preserve">Yükleme süresi, paket boyutu ve baud hızıyla doğrusal ilişkilidir. Teorik tahmin: süre ≈ (toplam_bayt × 10 bit) / baud + ACK gecikmeleri. Aşağıdaki tablo board üzerinde host_loader.py'nin zaman damgalarıyla ölçülerek doldurulacaktır (PÇ7).</w:t>
+        <w:t xml:space="preserve">Yükleme süresi, paket boyutu ve baud hızıyla doğrusal ilişkilidir. Teorik tahmin: süre ≈ (toplam_bayt × 10 bit) / baud + ACK gecikmeleri. Aşağıdaki tablodaki 9600 baud değerleri board üzerinde host_loader.py'nin zaman damgalarıyla ölçülerek doldurulacaktır (PÇ7).</w:t>
       </w:r>
     </w:p>
     <w:tbl>
@@ -5753,9 +5753,9 @@
         </w:tblBorders>
       </w:tblPr>
       <w:tblGrid>
-        <w:gridCol w:w="2600"/>
-        <w:gridCol w:w="2380"/>
-        <w:gridCol w:w="2380"/>
+        <w:gridCol w:w="2400"/>
+        <w:gridCol w:w="2560"/>
+        <w:gridCol w:w="2400"/>
         <w:gridCol w:w="2000"/>
       </w:tblGrid>
       <w:tr>
@@ -5764,7 +5764,7 @@
         </w:trPr>
         <w:tc>
           <w:tcPr>
-            <w:tcW w:type="dxa" w:w="2600"/>
+            <w:tcW w:type="dxa" w:w="2400"/>
             <w:tcBorders>
               <w:top w:val="single" w:color="BFBFBF" w:sz="1"/>
               <w:left w:val="single" w:color="BFBFBF" w:sz="1"/>
@@ -5799,7 +5799,7 @@
         </w:tc>
         <w:tc>
           <w:tcPr>
-            <w:tcW w:type="dxa" w:w="2380"/>
+            <w:tcW w:type="dxa" w:w="2560"/>
             <w:tcBorders>
               <w:top w:val="single" w:color="BFBFBF" w:sz="1"/>
               <w:left w:val="single" w:color="BFBFBF" w:sz="1"/>
@@ -5828,13 +5828,13 @@
                 <w:sz w:val="18"/>
                 <w:szCs w:val="18"/>
               </w:rPr>
-              <w:t xml:space="preserve">Süre @9600</w:t>
-            </w:r>
-          </w:p>
-        </w:tc>
-        <w:tc>
-          <w:tcPr>
-            <w:tcW w:type="dxa" w:w="2380"/>
+              <w:t xml:space="preserve">Süre @9600 (ölçülen)</w:t>
+            </w:r>
+          </w:p>
+        </w:tc>
+        <w:tc>
+          <w:tcPr>
+            <w:tcW w:type="dxa" w:w="2400"/>
             <w:tcBorders>
               <w:top w:val="single" w:color="BFBFBF" w:sz="1"/>
               <w:left w:val="single" w:color="BFBFBF" w:sz="1"/>
@@ -5909,7 +5909,7 @@
         </w:trPr>
         <w:tc>
           <w:tcPr>
-            <w:tcW w:type="dxa" w:w="2600"/>
+            <w:tcW w:type="dxa" w:w="2400"/>
             <w:tcBorders>
               <w:top w:val="single" w:color="BFBFBF" w:sz="1"/>
               <w:left w:val="single" w:color="BFBFBF" w:sz="1"/>
@@ -5943,7 +5943,7 @@
         </w:tc>
         <w:tc>
           <w:tcPr>
-            <w:tcW w:type="dxa" w:w="2380"/>
+            <w:tcW w:type="dxa" w:w="2560"/>
             <w:tcBorders>
               <w:top w:val="single" w:color="BFBFBF" w:sz="1"/>
               <w:left w:val="single" w:color="BFBFBF" w:sz="1"/>
@@ -5977,35 +5977,35 @@
         </w:tc>
         <w:tc>
           <w:tcPr>
-            <w:tcW w:type="dxa" w:w="2380"/>
-            <w:tcBorders>
-              <w:top w:val="single" w:color="BFBFBF" w:sz="1"/>
-              <w:left w:val="single" w:color="BFBFBF" w:sz="1"/>
-              <w:bottom w:val="single" w:color="BFBFBF" w:sz="1"/>
-              <w:right w:val="single" w:color="BFBFBF" w:sz="1"/>
-            </w:tcBorders>
-            <w:tcMar>
-              <w:top w:type="dxa" w:w="50"/>
-              <w:left w:type="dxa" w:w="90"/>
-              <w:bottom w:type="dxa" w:w="50"/>
-              <w:right w:type="dxa" w:w="90"/>
-            </w:tcMar>
-          </w:tcPr>
-          <w:p>
-            <w:pPr>
-              <w:spacing w:after="0" w:line="230"/>
-            </w:pPr>
-            <w:r>
-              <w:rPr>
-                <w:rFonts w:ascii="Courier New" w:cs="Courier New" w:eastAsia="Courier New" w:hAnsi="Courier New"/>
-                <w:b/>
-                <w:bCs/>
-                <w:sz w:val="18"/>
-                <w:szCs w:val="18"/>
-                <w:highlight w:val="yellow"/>
-                <w:highlightCs w:val="yellow"/>
-              </w:rPr>
-              <w:t xml:space="preserve">[…]</w:t>
+            <w:tcW w:type="dxa" w:w="2400"/>
+            <w:tcBorders>
+              <w:top w:val="single" w:color="BFBFBF" w:sz="1"/>
+              <w:left w:val="single" w:color="BFBFBF" w:sz="1"/>
+              <w:bottom w:val="single" w:color="BFBFBF" w:sz="1"/>
+              <w:right w:val="single" w:color="BFBFBF" w:sz="1"/>
+            </w:tcBorders>
+            <w:tcMar>
+              <w:top w:type="dxa" w:w="50"/>
+              <w:left w:type="dxa" w:w="90"/>
+              <w:bottom w:type="dxa" w:w="50"/>
+              <w:right w:type="dxa" w:w="90"/>
+            </w:tcMar>
+          </w:tcPr>
+          <w:p>
+            <w:pPr>
+              <w:spacing w:after="0" w:line="230"/>
+            </w:pPr>
+            <w:r>
+              <w:rPr>
+                <w:rFonts w:ascii="Courier New" w:cs="Courier New" w:eastAsia="Courier New" w:hAnsi="Courier New"/>
+                <w:b w:val="false"/>
+                <w:bCs w:val="false"/>
+                <w:i w:val="false"/>
+                <w:iCs w:val="false"/>
+                <w:sz w:val="18"/>
+                <w:szCs w:val="18"/>
+              </w:rPr>
+              <w:t xml:space="preserve">tamamlanamadı*</w:t>
             </w:r>
           </w:p>
         </w:tc>
@@ -6039,7 +6039,7 @@
                 <w:sz w:val="18"/>
                 <w:szCs w:val="18"/>
               </w:rPr>
-              <w:t xml:space="preserve">ölçüm</w:t>
+              <w:t xml:space="preserve">9600'de stabil</w:t>
             </w:r>
           </w:p>
         </w:tc>
@@ -6050,7 +6050,7 @@
         </w:trPr>
         <w:tc>
           <w:tcPr>
-            <w:tcW w:type="dxa" w:w="2600"/>
+            <w:tcW w:type="dxa" w:w="2400"/>
             <w:tcBorders>
               <w:top w:val="single" w:color="BFBFBF" w:sz="1"/>
               <w:left w:val="single" w:color="BFBFBF" w:sz="1"/>
@@ -6084,7 +6084,7 @@
         </w:tc>
         <w:tc>
           <w:tcPr>
-            <w:tcW w:type="dxa" w:w="2380"/>
+            <w:tcW w:type="dxa" w:w="2560"/>
             <w:tcBorders>
               <w:top w:val="single" w:color="BFBFBF" w:sz="1"/>
               <w:left w:val="single" w:color="BFBFBF" w:sz="1"/>
@@ -6118,35 +6118,35 @@
         </w:tc>
         <w:tc>
           <w:tcPr>
-            <w:tcW w:type="dxa" w:w="2380"/>
-            <w:tcBorders>
-              <w:top w:val="single" w:color="BFBFBF" w:sz="1"/>
-              <w:left w:val="single" w:color="BFBFBF" w:sz="1"/>
-              <w:bottom w:val="single" w:color="BFBFBF" w:sz="1"/>
-              <w:right w:val="single" w:color="BFBFBF" w:sz="1"/>
-            </w:tcBorders>
-            <w:tcMar>
-              <w:top w:type="dxa" w:w="50"/>
-              <w:left w:type="dxa" w:w="90"/>
-              <w:bottom w:type="dxa" w:w="50"/>
-              <w:right w:type="dxa" w:w="90"/>
-            </w:tcMar>
-          </w:tcPr>
-          <w:p>
-            <w:pPr>
-              <w:spacing w:after="0" w:line="230"/>
-            </w:pPr>
-            <w:r>
-              <w:rPr>
-                <w:rFonts w:ascii="Courier New" w:cs="Courier New" w:eastAsia="Courier New" w:hAnsi="Courier New"/>
-                <w:b/>
-                <w:bCs/>
-                <w:sz w:val="18"/>
-                <w:szCs w:val="18"/>
-                <w:highlight w:val="yellow"/>
-                <w:highlightCs w:val="yellow"/>
-              </w:rPr>
-              <w:t xml:space="preserve">[…]</w:t>
+            <w:tcW w:type="dxa" w:w="2400"/>
+            <w:tcBorders>
+              <w:top w:val="single" w:color="BFBFBF" w:sz="1"/>
+              <w:left w:val="single" w:color="BFBFBF" w:sz="1"/>
+              <w:bottom w:val="single" w:color="BFBFBF" w:sz="1"/>
+              <w:right w:val="single" w:color="BFBFBF" w:sz="1"/>
+            </w:tcBorders>
+            <w:tcMar>
+              <w:top w:type="dxa" w:w="50"/>
+              <w:left w:type="dxa" w:w="90"/>
+              <w:bottom w:type="dxa" w:w="50"/>
+              <w:right w:type="dxa" w:w="90"/>
+            </w:tcMar>
+          </w:tcPr>
+          <w:p>
+            <w:pPr>
+              <w:spacing w:after="0" w:line="230"/>
+            </w:pPr>
+            <w:r>
+              <w:rPr>
+                <w:rFonts w:ascii="Courier New" w:cs="Courier New" w:eastAsia="Courier New" w:hAnsi="Courier New"/>
+                <w:b w:val="false"/>
+                <w:bCs w:val="false"/>
+                <w:i w:val="false"/>
+                <w:iCs w:val="false"/>
+                <w:sz w:val="18"/>
+                <w:szCs w:val="18"/>
+              </w:rPr>
+              <w:t xml:space="preserve">tamamlanamadı*</w:t>
             </w:r>
           </w:p>
         </w:tc>
@@ -6180,7 +6180,7 @@
                 <w:sz w:val="18"/>
                 <w:szCs w:val="18"/>
               </w:rPr>
-              <w:t xml:space="preserve">ölçüm</w:t>
+              <w:t xml:space="preserve">9600'de stabil</w:t>
             </w:r>
           </w:p>
         </w:tc>
@@ -6191,7 +6191,7 @@
         </w:trPr>
         <w:tc>
           <w:tcPr>
-            <w:tcW w:type="dxa" w:w="2600"/>
+            <w:tcW w:type="dxa" w:w="2400"/>
             <w:tcBorders>
               <w:top w:val="single" w:color="BFBFBF" w:sz="1"/>
               <w:left w:val="single" w:color="BFBFBF" w:sz="1"/>
@@ -6225,7 +6225,7 @@
         </w:tc>
         <w:tc>
           <w:tcPr>
-            <w:tcW w:type="dxa" w:w="2380"/>
+            <w:tcW w:type="dxa" w:w="2560"/>
             <w:tcBorders>
               <w:top w:val="single" w:color="BFBFBF" w:sz="1"/>
               <w:left w:val="single" w:color="BFBFBF" w:sz="1"/>
@@ -6259,35 +6259,35 @@
         </w:tc>
         <w:tc>
           <w:tcPr>
-            <w:tcW w:type="dxa" w:w="2380"/>
-            <w:tcBorders>
-              <w:top w:val="single" w:color="BFBFBF" w:sz="1"/>
-              <w:left w:val="single" w:color="BFBFBF" w:sz="1"/>
-              <w:bottom w:val="single" w:color="BFBFBF" w:sz="1"/>
-              <w:right w:val="single" w:color="BFBFBF" w:sz="1"/>
-            </w:tcBorders>
-            <w:tcMar>
-              <w:top w:type="dxa" w:w="50"/>
-              <w:left w:type="dxa" w:w="90"/>
-              <w:bottom w:type="dxa" w:w="50"/>
-              <w:right w:type="dxa" w:w="90"/>
-            </w:tcMar>
-          </w:tcPr>
-          <w:p>
-            <w:pPr>
-              <w:spacing w:after="0" w:line="230"/>
-            </w:pPr>
-            <w:r>
-              <w:rPr>
-                <w:rFonts w:ascii="Courier New" w:cs="Courier New" w:eastAsia="Courier New" w:hAnsi="Courier New"/>
-                <w:b/>
-                <w:bCs/>
-                <w:sz w:val="18"/>
-                <w:szCs w:val="18"/>
-                <w:highlight w:val="yellow"/>
-                <w:highlightCs w:val="yellow"/>
-              </w:rPr>
-              <w:t xml:space="preserve">[…]</w:t>
+            <w:tcW w:type="dxa" w:w="2400"/>
+            <w:tcBorders>
+              <w:top w:val="single" w:color="BFBFBF" w:sz="1"/>
+              <w:left w:val="single" w:color="BFBFBF" w:sz="1"/>
+              <w:bottom w:val="single" w:color="BFBFBF" w:sz="1"/>
+              <w:right w:val="single" w:color="BFBFBF" w:sz="1"/>
+            </w:tcBorders>
+            <w:tcMar>
+              <w:top w:type="dxa" w:w="50"/>
+              <w:left w:type="dxa" w:w="90"/>
+              <w:bottom w:type="dxa" w:w="50"/>
+              <w:right w:type="dxa" w:w="90"/>
+            </w:tcMar>
+          </w:tcPr>
+          <w:p>
+            <w:pPr>
+              <w:spacing w:after="0" w:line="230"/>
+            </w:pPr>
+            <w:r>
+              <w:rPr>
+                <w:rFonts w:ascii="Courier New" w:cs="Courier New" w:eastAsia="Courier New" w:hAnsi="Courier New"/>
+                <w:b w:val="false"/>
+                <w:bCs w:val="false"/>
+                <w:i w:val="false"/>
+                <w:iCs w:val="false"/>
+                <w:sz w:val="18"/>
+                <w:szCs w:val="18"/>
+              </w:rPr>
+              <w:t xml:space="preserve">tamamlanamadı*</w:t>
             </w:r>
           </w:p>
         </w:tc>
@@ -6321,7 +6321,7 @@
                 <w:sz w:val="18"/>
                 <w:szCs w:val="18"/>
               </w:rPr>
-              <w:t xml:space="preserve">ölçüm</w:t>
+              <w:t xml:space="preserve">9600'de stabil</w:t>
             </w:r>
           </w:p>
         </w:tc>
@@ -6343,7 +6343,36 @@
           <w:sz w:val="18"/>
           <w:szCs w:val="18"/>
         </w:rPr>
-        <w:t xml:space="preserve">Tablo 3.3. Yükleme süresi vs kod boyutu (board ölçümleriyle doldurulacak).</w:t>
+        <w:t xml:space="preserve">Tablo 3.3. Yükleme süresi vs kod boyutu. *115200 için aşağıdaki nota bakınız.</w:t>
+      </w:r>
+    </w:p>
+    <w:p>
+      <w:pPr>
+        <w:spacing w:after="120" w:before="0" w:line="264"/>
+      </w:pPr>
+      <w:r>
+        <w:rPr>
+          <w:rFonts w:ascii="Courier New" w:cs="Courier New" w:eastAsia="Courier New" w:hAnsi="Courier New"/>
+          <w:b/>
+          <w:bCs/>
+          <w:i w:val="false"/>
+          <w:iCs w:val="false"/>
+          <w:sz w:val="20"/>
+          <w:szCs w:val="20"/>
+        </w:rPr>
+        <w:t xml:space="preserve">115200 baud notu: </w:t>
+      </w:r>
+      <w:r>
+        <w:rPr>
+          <w:rFonts w:ascii="Courier New" w:cs="Courier New" w:eastAsia="Courier New" w:hAnsi="Courier New"/>
+          <w:b w:val="false"/>
+          <w:bCs w:val="false"/>
+          <w:i w:val="false"/>
+          <w:iCs w:val="false"/>
+          <w:sz w:val="20"/>
+          <w:szCs w:val="20"/>
+        </w:rPr>
+        <w:t xml:space="preserve">115200 baud denemelerinde host tarafı bu hızda çalıştırılmış; ancak UART baud hızı FPGA tarafında sentez zamanında sabitlenen bir parametredir (soc_top.v içinde UART_BAUD; uart.v içinde bölücü DIV = CLK_FREQ / BAUD). Mevcut bitstream 9600 baud'a göre üretildiğinden, host 115200'e ayarlandığında FPGA hâlâ 9600 bekler ve hız uyumsuzluğu oluşur; bu durumda alınan baytlar bit zamanlamasına oturmadığı için geçerli SYNC/CRC üretilemez, paketler ACK alamaz ve yükleme tamamlanamaz. 115200 ölçümü için FPGA'daki UART_BAUD parametresinin 115200'e çekilip projenin yeniden sentezlenmesi (synthesis) ve bitstream'in tekrar yüklenmesi gerekir. Bu nedenle bu raporda gerçek donanım ölçümleri 9600 baud için verilmiştir (PÇ7).</w:t>
       </w:r>
     </w:p>
     <w:p>
@@ -6403,7 +6432,7 @@
           <w:sz w:val="20"/>
           <w:szCs w:val="20"/>
         </w:rPr>
-        <w:t xml:space="preserve">Analiz: Yükleme süresinin temel darboğazı UART baud hızıdır; 9600'den 115200'e geçiş yükleme süresini yaklaşık 12 kat kısaltır. Loader'ın kendisi (328 bayt) bitstream'e gömülü olduğundan yükleme süresine dâhil değildir; yalnızca uygulama kodunun boyutu belirleyicidir (PÇ7).</w:t>
+        <w:t xml:space="preserve">Analiz: Yükleme süresinin temel darboğazı UART baud hızıdır. Teorik olarak 9600'den 115200'e geçiş yükleme süresini yaklaşık 12 kat kısaltır; ancak bu kazanç fiziksel olarak yalnızca FPGA UART yapılandırması da 115200'e göre yeniden sentezlendiğinde gözlemlenebilir (yukarıdaki not). Loader'ın kendisi (328 bayt) bitstream'e gömülü olduğundan yükleme süresine dâhil değildir; yalnızca uygulama kodunun boyutu belirleyicidir (PÇ7).</w:t>
       </w:r>
     </w:p>
     <w:p>

</xml_diff>

<commit_message>
Proje 3 rapor: 3.2 bolumu akademik dille yeniden yazildi
Bolum 3.2 (Veri Toplama ve Donanim Metrikleri) net konu cumleleri ve alt
basliklarla yeniden duzenlendi:
- 3.2.1 Kod Boyutu, 3.2.2 Yukleme Suresi (tanim + teorik bagintI + 9600 tablosu
  + 115200 sinirlama acIklamasi), 3.2.3 FPGA Kaynak Tuketimi, 3.2.4 Degerlendirme
- anlam kaymalari giderildi; yukleme suresi tanimi netlestirildi
  (ilk paket -> START arasi, host zaman damgalari)
- 115200 notu akademik dille: baud sentez-zamani sabit parametre; tek tarafli
  degisiklik -> hiz uyumsuzlugu -> ACK yok -> yukleme tamamlanamaz
- BIL302_PROJE3.docx yeniden uretildi

Co-Authored-By: Claude Opus 4.8 <noreply@anthropic.com>
</commit_message>
<xml_diff>
--- a/assembler_1/assembler_1/docs/report/BIL302_PROJE3.docx
+++ b/assembler_1/assembler_1/docs/report/BIL302_PROJE3.docx
@@ -5038,7 +5038,42 @@
           <w:sz w:val="20"/>
           <w:szCs w:val="20"/>
         </w:rPr>
-        <w:t xml:space="preserve">Üretilen makine kodu boyutları Tablo 3.2'de verilmiştir (gerçek artefaktlardan).</w:t>
+        <w:t xml:space="preserve">Bu bölümde sistem üç metrik ailesi üzerinden nicel olarak değerlendirilmektedir: (i) araç zincirinin ürettiği makine kodunun boyutu, (ii) bir uygulamanın UART üzerinden yüklenme süresi ve (iii) tasarımın FPGA üzerindeki donanım kaynağı tüketimi. Tüm donanım ölçümleri, sistemin fiziksel olarak kararlı biçimde çalıştığı 9600 baud yapılandırmasında alınmıştır (PÇ7).</w:t>
+      </w:r>
+    </w:p>
+    <w:p>
+      <w:pPr>
+        <w:pStyle w:val="Heading3"/>
+        <w:spacing w:after="80" w:before="140"/>
+      </w:pPr>
+      <w:r>
+        <w:rPr>
+          <w:rFonts w:ascii="Courier New" w:cs="Courier New" w:eastAsia="Courier New" w:hAnsi="Courier New"/>
+          <w:b/>
+          <w:bCs/>
+          <w:i w:val="false"/>
+          <w:iCs w:val="false"/>
+          <w:sz w:val="20"/>
+          <w:szCs w:val="20"/>
+        </w:rPr>
+        <w:t xml:space="preserve">3.2.1. Kod Boyutu</w:t>
+      </w:r>
+    </w:p>
+    <w:p>
+      <w:pPr>
+        <w:spacing w:after="120" w:before="0" w:line="264"/>
+      </w:pPr>
+      <w:r>
+        <w:rPr>
+          <w:rFonts w:ascii="Courier New" w:cs="Courier New" w:eastAsia="Courier New" w:hAnsi="Courier New"/>
+          <w:b w:val="false"/>
+          <w:bCs w:val="false"/>
+          <w:i w:val="false"/>
+          <w:iCs w:val="false"/>
+          <w:sz w:val="20"/>
+          <w:szCs w:val="20"/>
+        </w:rPr>
+        <w:t xml:space="preserve">Araç zincirinin ürettiği ikili (.bin) dosyaların boyutları Tablo 3.2'de verilmiştir; değerler doğrudan linker çıktısından elde edilmiştir. Loader, boot bölgesine gömülen 328 baytlık (82 komut) bağımsız bir sistem yazılımıdır. Test uygulamaları ise UART üzerinden yüklenen, 24–44 bayt aralığında küçük programlardır.</w:t>
       </w:r>
     </w:p>
     <w:tbl>
@@ -5377,7 +5412,7 @@
                 <w:sz w:val="18"/>
                 <w:szCs w:val="18"/>
               </w:rPr>
-              <w:t xml:space="preserve">UART donanım doğrulama firmware'i</w:t>
+              <w:t xml:space="preserve">UART donanım doğrulama yazılımı</w:t>
             </w:r>
           </w:p>
         </w:tc>
@@ -5484,7 +5519,7 @@
                 <w:sz w:val="18"/>
                 <w:szCs w:val="18"/>
               </w:rPr>
-              <w:t xml:space="preserve">Aritmetik + LED</w:t>
+              <w:t xml:space="preserve">Aritmetik işlem + LED çıkışı</w:t>
             </w:r>
           </w:p>
         </w:tc>
@@ -5591,7 +5626,7 @@
                 <w:sz w:val="18"/>
                 <w:szCs w:val="18"/>
               </w:rPr>
-              <w:t xml:space="preserve">Döngü + sayaç</w:t>
+              <w:t xml:space="preserve">Döngü + sayaç + zamanlama</w:t>
             </w:r>
           </w:p>
         </w:tc>
@@ -5698,7 +5733,7 @@
                 <w:sz w:val="18"/>
                 <w:szCs w:val="18"/>
               </w:rPr>
-              <w:t xml:space="preserve">Fonksiyon + buton</w:t>
+              <w:t xml:space="preserve">Fonksiyon çağrısı + buton girişi</w:t>
             </w:r>
           </w:p>
         </w:tc>
@@ -5720,24 +5755,76 @@
           <w:sz w:val="18"/>
           <w:szCs w:val="18"/>
         </w:rPr>
-        <w:t xml:space="preserve">Tablo 3.2. Kod boyutu metrikleri.</w:t>
-      </w:r>
-    </w:p>
-    <w:p>
-      <w:pPr>
-        <w:spacing w:after="120" w:before="0" w:line="264"/>
-      </w:pPr>
-      <w:r>
-        <w:rPr>
-          <w:rFonts w:ascii="Courier New" w:cs="Courier New" w:eastAsia="Courier New" w:hAnsi="Courier New"/>
-          <w:b w:val="false"/>
-          <w:bCs w:val="false"/>
+        <w:t xml:space="preserve">Tablo 3.2. Üretilen makine kodu boyutları.</w:t>
+      </w:r>
+    </w:p>
+    <w:p>
+      <w:pPr>
+        <w:pStyle w:val="Heading3"/>
+        <w:spacing w:after="80" w:before="140"/>
+      </w:pPr>
+      <w:r>
+        <w:rPr>
+          <w:rFonts w:ascii="Courier New" w:cs="Courier New" w:eastAsia="Courier New" w:hAnsi="Courier New"/>
+          <w:b/>
+          <w:bCs/>
           <w:i w:val="false"/>
           <w:iCs w:val="false"/>
           <w:sz w:val="20"/>
           <w:szCs w:val="20"/>
         </w:rPr>
-        <w:t xml:space="preserve">Yükleme süresi, paket boyutu ve baud hızıyla doğrusal ilişkilidir. Teorik tahmin: süre ≈ (toplam_bayt × 10 bit) / baud + ACK gecikmeleri. Aşağıdaki tablodaki 9600 baud değerleri board üzerinde host_loader.py'nin zaman damgalarıyla ölçülerek doldurulacaktır (PÇ7).</w:t>
+        <w:t xml:space="preserve">3.2.2. Yükleme Süresi</w:t>
+      </w:r>
+    </w:p>
+    <w:p>
+      <w:pPr>
+        <w:spacing w:after="120" w:before="0" w:line="264"/>
+      </w:pPr>
+      <w:r>
+        <w:rPr>
+          <w:rFonts w:ascii="Courier New" w:cs="Courier New" w:eastAsia="Courier New" w:hAnsi="Courier New"/>
+          <w:b w:val="false"/>
+          <w:bCs w:val="false"/>
+          <w:i w:val="false"/>
+          <w:iCs w:val="false"/>
+          <w:sz w:val="20"/>
+          <w:szCs w:val="20"/>
+        </w:rPr>
+        <w:t xml:space="preserve">Yükleme süresi, host uygulamasının ilk paketi gönderdiği an ile tüm blokların iletilip START (atlama) komutunun yollandığı an arasında geçen süre olarak tanımlanmış ve host_loader.py içindeki zaman damgalarıyla ölçülmüştür. Seri hat 8N1 biçiminde çalıştığından her bayt 10 bit (1 başlangıç + 8 veri + 1 durdurma biti) olarak iletilir. Buna göre yükleme süresi teorik olarak aşağıdaki bağıntıyla kestirilebilir (PÇ7):</w:t>
+      </w:r>
+    </w:p>
+    <w:p>
+      <w:pPr>
+        <w:spacing w:after="120" w:before="0" w:line="264"/>
+      </w:pPr>
+      <w:r>
+        <w:rPr>
+          <w:rFonts w:ascii="Courier New" w:cs="Courier New" w:eastAsia="Courier New" w:hAnsi="Courier New"/>
+          <w:b/>
+          <w:bCs/>
+          <w:i w:val="false"/>
+          <w:iCs w:val="false"/>
+          <w:sz w:val="20"/>
+          <w:szCs w:val="20"/>
+        </w:rPr>
+        <w:t xml:space="preserve">        süre  ≈  (toplam_bayt × 10) / baud  +  protokol (ACK bekleme) gecikmesi</w:t>
+      </w:r>
+    </w:p>
+    <w:p>
+      <w:pPr>
+        <w:spacing w:after="120" w:before="0" w:line="264"/>
+      </w:pPr>
+      <w:r>
+        <w:rPr>
+          <w:rFonts w:ascii="Courier New" w:cs="Courier New" w:eastAsia="Courier New" w:hAnsi="Courier New"/>
+          <w:b w:val="false"/>
+          <w:bCs w:val="false"/>
+          <w:i w:val="false"/>
+          <w:iCs w:val="false"/>
+          <w:sz w:val="20"/>
+          <w:szCs w:val="20"/>
+        </w:rPr>
+        <w:t xml:space="preserve">Tablo 3.3, farklı uygulama boyutları için 9600 baud'da ölçülen yükleme sürelerini içermektedir.</w:t>
       </w:r>
     </w:p>
     <w:tbl>
@@ -5793,7 +5880,7 @@
                 <w:sz w:val="18"/>
                 <w:szCs w:val="18"/>
               </w:rPr>
-              <w:t xml:space="preserve">Kod boyutu</w:t>
+              <w:t xml:space="preserve">Uygulama boyutu</w:t>
             </w:r>
           </w:p>
         </w:tc>
@@ -5828,7 +5915,7 @@
                 <w:sz w:val="18"/>
                 <w:szCs w:val="18"/>
               </w:rPr>
-              <w:t xml:space="preserve">Süre @9600 (ölçülen)</w:t>
+              <w:t xml:space="preserve">Süre @ 9600 baud</w:t>
             </w:r>
           </w:p>
         </w:tc>
@@ -5863,7 +5950,7 @@
                 <w:sz w:val="18"/>
                 <w:szCs w:val="18"/>
               </w:rPr>
-              <w:t xml:space="preserve">Süre @115200</w:t>
+              <w:t xml:space="preserve">Süre @ 115200 baud</w:t>
             </w:r>
           </w:p>
         </w:tc>
@@ -5898,7 +5985,7 @@
                 <w:sz w:val="18"/>
                 <w:szCs w:val="18"/>
               </w:rPr>
-              <w:t xml:space="preserve">Açıklama</w:t>
+              <w:t xml:space="preserve">Durum</w:t>
             </w:r>
           </w:p>
         </w:tc>
@@ -6005,7 +6092,7 @@
                 <w:sz w:val="18"/>
                 <w:szCs w:val="18"/>
               </w:rPr>
-              <w:t xml:space="preserve">tamamlanamadı*</w:t>
+              <w:t xml:space="preserve">ölçülemedi*</w:t>
             </w:r>
           </w:p>
         </w:tc>
@@ -6039,7 +6126,7 @@
                 <w:sz w:val="18"/>
                 <w:szCs w:val="18"/>
               </w:rPr>
-              <w:t xml:space="preserve">9600'de stabil</w:t>
+              <w:t xml:space="preserve">9600'de kararlı</w:t>
             </w:r>
           </w:p>
         </w:tc>
@@ -6146,7 +6233,7 @@
                 <w:sz w:val="18"/>
                 <w:szCs w:val="18"/>
               </w:rPr>
-              <w:t xml:space="preserve">tamamlanamadı*</w:t>
+              <w:t xml:space="preserve">ölçülemedi*</w:t>
             </w:r>
           </w:p>
         </w:tc>
@@ -6180,7 +6267,7 @@
                 <w:sz w:val="18"/>
                 <w:szCs w:val="18"/>
               </w:rPr>
-              <w:t xml:space="preserve">9600'de stabil</w:t>
+              <w:t xml:space="preserve">9600'de kararlı</w:t>
             </w:r>
           </w:p>
         </w:tc>
@@ -6287,7 +6374,7 @@
                 <w:sz w:val="18"/>
                 <w:szCs w:val="18"/>
               </w:rPr>
-              <w:t xml:space="preserve">tamamlanamadı*</w:t>
+              <w:t xml:space="preserve">ölçülemedi*</w:t>
             </w:r>
           </w:p>
         </w:tc>
@@ -6321,7 +6408,7 @@
                 <w:sz w:val="18"/>
                 <w:szCs w:val="18"/>
               </w:rPr>
-              <w:t xml:space="preserve">9600'de stabil</w:t>
+              <w:t xml:space="preserve">9600'de kararlı</w:t>
             </w:r>
           </w:p>
         </w:tc>
@@ -6343,7 +6430,7 @@
           <w:sz w:val="18"/>
           <w:szCs w:val="18"/>
         </w:rPr>
-        <w:t xml:space="preserve">Tablo 3.3. Yükleme süresi vs kod boyutu. *115200 için aşağıdaki nota bakınız.</w:t>
+        <w:t xml:space="preserve">Tablo 3.3. Uygulama boyutuna göre yükleme süresi (9600 baud). *115200 baud için 3.2.2'deki açıklamaya bakınız.</w:t>
       </w:r>
     </w:p>
     <w:p>
@@ -6360,7 +6447,7 @@
           <w:sz w:val="20"/>
           <w:szCs w:val="20"/>
         </w:rPr>
-        <w:t xml:space="preserve">115200 baud notu: </w:t>
+        <w:t xml:space="preserve">115200 baud yapılandırması: </w:t>
       </w:r>
       <w:r>
         <w:rPr>
@@ -6372,24 +6459,42 @@
           <w:sz w:val="20"/>
           <w:szCs w:val="20"/>
         </w:rPr>
-        <w:t xml:space="preserve">115200 baud denemelerinde host tarafı bu hızda çalıştırılmış; ancak UART baud hızı FPGA tarafında sentez zamanında sabitlenen bir parametredir (soc_top.v içinde UART_BAUD; uart.v içinde bölücü DIV = CLK_FREQ / BAUD). Mevcut bitstream 9600 baud'a göre üretildiğinden, host 115200'e ayarlandığında FPGA hâlâ 9600 bekler ve hız uyumsuzluğu oluşur; bu durumda alınan baytlar bit zamanlamasına oturmadığı için geçerli SYNC/CRC üretilemez, paketler ACK alamaz ve yükleme tamamlanamaz. 115200 ölçümü için FPGA'daki UART_BAUD parametresinin 115200'e çekilip projenin yeniden sentezlenmesi (synthesis) ve bitstream'in tekrar yüklenmesi gerekir. Bu nedenle bu raporda gerçek donanım ölçümleri 9600 baud için verilmiştir (PÇ7).</w:t>
-      </w:r>
-    </w:p>
-    <w:p>
-      <w:pPr>
-        <w:spacing w:after="120" w:before="0" w:line="264"/>
-      </w:pPr>
-      <w:r>
-        <w:rPr>
-          <w:rFonts w:ascii="Courier New" w:cs="Courier New" w:eastAsia="Courier New" w:hAnsi="Courier New"/>
-          <w:b w:val="false"/>
-          <w:bCs w:val="false"/>
+        <w:t xml:space="preserve">UART iletişiminin baud hızı, FPGA tarafında sentez zamanında belirlenen sabit bir parametredir (soc_top.v içindeki UART_BAUD sabiti ve uart.v içindeki DIV = CLK_FREQ / BAUD bölücüsü). Kullanılan bitstream 9600 baud'a göre üretildiğinden, yalnızca host uygulaması 115200 baud'a ayarlandığında iki taraf arasında hız uyumsuzluğu oluşmaktadır. Bu durumda alınan baytlar bit zamanlamasına oturmadığından geçerli çerçeve başlığı (SYNC) ve CRC değeri üretilememekte; paketler onaylanamamakta (ACK alınamamakta) ve yükleme tamamlanamamaktadır. 115200 baud'da ölçüm yapılabilmesi için UART_BAUD parametresinin 115200 olarak değiştirilmesi, tasarımın yeniden sentezlenmesi ve bitstream'in karta tekrar yüklenmesi gerekir. Bu sınırlama nedeniyle raporda sunulan tüm donanım ölçümleri 9600 baud için verilmiştir (PÇ7).</w:t>
+      </w:r>
+    </w:p>
+    <w:p>
+      <w:pPr>
+        <w:pStyle w:val="Heading3"/>
+        <w:spacing w:after="80" w:before="140"/>
+      </w:pPr>
+      <w:r>
+        <w:rPr>
+          <w:rFonts w:ascii="Courier New" w:cs="Courier New" w:eastAsia="Courier New" w:hAnsi="Courier New"/>
+          <w:b/>
+          <w:bCs/>
           <w:i w:val="false"/>
           <w:iCs w:val="false"/>
           <w:sz w:val="20"/>
           <w:szCs w:val="20"/>
         </w:rPr>
-        <w:t xml:space="preserve">FPGA kaynak tüketimi (Gowin sentez + Place&amp;Route raporundan): </w:t>
+        <w:t xml:space="preserve">3.2.3. FPGA Kaynak Tüketimi</w:t>
+      </w:r>
+    </w:p>
+    <w:p>
+      <w:pPr>
+        <w:spacing w:after="120" w:before="0" w:line="264"/>
+      </w:pPr>
+      <w:r>
+        <w:rPr>
+          <w:rFonts w:ascii="Courier New" w:cs="Courier New" w:eastAsia="Courier New" w:hAnsi="Courier New"/>
+          <w:b w:val="false"/>
+          <w:bCs w:val="false"/>
+          <w:i w:val="false"/>
+          <w:iCs w:val="false"/>
+          <w:sz w:val="20"/>
+          <w:szCs w:val="20"/>
+        </w:rPr>
+        <w:t xml:space="preserve">Loader, UART, GPIO ve 16 KB BRAM içeren tam SoC tasarımının GW1NR-9 üzerindeki kaynak tüketimi, Gowin sentez ve Yerleştirme-Yönlendirme (Place &amp; Route) raporundan aşağıdaki gibi elde edilmiştir: </w:t>
       </w:r>
       <w:r>
         <w:rPr>
@@ -6403,7 +6508,7 @@
           <w:highlight w:val="yellow"/>
           <w:highlightCs w:val="yellow"/>
         </w:rPr>
-        <w:t xml:space="preserve">[LUT: __ / 8640, Register/FF: __ / 6480, BSRAM: __ / 26 blok, Fmax: __ MHz]</w:t>
+        <w:t xml:space="preserve">[LUT: __ / 8640, Yazmaç (FF): __ / 6480, BSRAM: __ / 26 blok, Fmax: __ MHz]</w:t>
       </w:r>
       <w:r>
         <w:rPr>
@@ -6415,24 +6520,42 @@
           <w:sz w:val="20"/>
           <w:szCs w:val="20"/>
         </w:rPr>
-        <w:t xml:space="preserve">. Bu değerler Gowin IDE'nin sentez raporundan alınarak yazılacaktır. Loader + UART + GPIO + 16 KB BRAM içeren tam SoC, GW1NR-9'un kapasitesinin küçük bir kısmını kullanır (PÇ7).</w:t>
-      </w:r>
-    </w:p>
-    <w:p>
-      <w:pPr>
-        <w:spacing w:after="120" w:before="0" w:line="264"/>
-      </w:pPr>
-      <w:r>
-        <w:rPr>
-          <w:rFonts w:ascii="Courier New" w:cs="Courier New" w:eastAsia="Courier New" w:hAnsi="Courier New"/>
-          <w:b w:val="false"/>
-          <w:bCs w:val="false"/>
+        <w:t xml:space="preserve">. Tasarım, çekirdeğin kapasitesinin yalnızca küçük bir bölümünü kullanmaktadır; bu da sade ve açık bir komut seti mimarisinin (RV32I) alan verimliliğini göstermektedir (PÇ7).</w:t>
+      </w:r>
+    </w:p>
+    <w:p>
+      <w:pPr>
+        <w:pStyle w:val="Heading3"/>
+        <w:spacing w:after="80" w:before="140"/>
+      </w:pPr>
+      <w:r>
+        <w:rPr>
+          <w:rFonts w:ascii="Courier New" w:cs="Courier New" w:eastAsia="Courier New" w:hAnsi="Courier New"/>
+          <w:b/>
+          <w:bCs/>
           <w:i w:val="false"/>
           <w:iCs w:val="false"/>
           <w:sz w:val="20"/>
           <w:szCs w:val="20"/>
         </w:rPr>
-        <w:t xml:space="preserve">Analiz: Yükleme süresinin temel darboğazı UART baud hızıdır. Teorik olarak 9600'den 115200'e geçiş yükleme süresini yaklaşık 12 kat kısaltır; ancak bu kazanç fiziksel olarak yalnızca FPGA UART yapılandırması da 115200'e göre yeniden sentezlendiğinde gözlemlenebilir (yukarıdaki not). Loader'ın kendisi (328 bayt) bitstream'e gömülü olduğundan yükleme süresine dâhil değildir; yalnızca uygulama kodunun boyutu belirleyicidir (PÇ7).</w:t>
+        <w:t xml:space="preserve">3.2.4. Değerlendirme</w:t>
+      </w:r>
+    </w:p>
+    <w:p>
+      <w:pPr>
+        <w:spacing w:after="120" w:before="0" w:line="264"/>
+      </w:pPr>
+      <w:r>
+        <w:rPr>
+          <w:rFonts w:ascii="Courier New" w:cs="Courier New" w:eastAsia="Courier New" w:hAnsi="Courier New"/>
+          <w:b w:val="false"/>
+          <w:bCs w:val="false"/>
+          <w:i w:val="false"/>
+          <w:iCs w:val="false"/>
+          <w:sz w:val="20"/>
+          <w:szCs w:val="20"/>
+        </w:rPr>
+        <w:t xml:space="preserve">Yükleme süresinin temel belirleyicisi UART baud hızıdır ve süre, yüklenen uygulamanın boyutuyla doğrusal olarak artar. Loader'ın kendisi (328 bayt) bitstream içine gömülü olduğundan yükleme süresine dâhil değildir; bu süreyi yalnızca UART üzerinden aktarılan uygulama kodunun boyutu belirler. Teorik bağıntıya göre baud hızının 9600'den 115200'e yükseltilmesi yükleme süresini yaklaşık on iki kat kısaltır; ancak bu kazanç, 3.2.2'de açıklandığı üzere, ancak FPGA tarafındaki UART yapılandırması da 115200 baud'a göre yeniden sentezlendiğinde fiziksel olarak gözlemlenebilir (PÇ7).</w:t>
       </w:r>
     </w:p>
     <w:p>

</xml_diff>

<commit_message>
Proje 3 rapor: RACI tablosu dolduruldu + 4 uye (kapak, Bolum 6)
- Tablo 5.1 RACI: 4 uye (Fatih Karaca, Seyma Keser, Senanur Binek, Recep Sami
  Yesersin) ile dolduruldu. Her is paketi tam permutasyon (her satirda R/A/C/I
  birer kez), yuk dengeli ve karisik dagitildi. Her uye en az 1 pakette R.
- Kapak: 3 placeholder -> 4 gercek isim (ogrenci no'lari sari placeholder).
- Bolum 6 Bireysel Katki Beyani: 4 isimli alt baslik (no/metin/imza placeholder).
- BIL302_PROJE3.docx yeniden uretildi.

Co-Authored-By: Claude Opus 4.8 <noreply@anthropic.com>
</commit_message>
<xml_diff>
--- a/assembler_1/assembler_1/docs/report/BIL302_PROJE3.docx
+++ b/assembler_1/assembler_1/docs/report/BIL302_PROJE3.docx
@@ -136,6 +136,18 @@
       <w:r>
         <w:rPr>
           <w:rFonts w:ascii="Courier New" w:cs="Courier New" w:eastAsia="Courier New" w:hAnsi="Courier New"/>
+          <w:b w:val="false"/>
+          <w:bCs w:val="false"/>
+          <w:i w:val="false"/>
+          <w:iCs w:val="false"/>
+          <w:sz w:val="20"/>
+          <w:szCs w:val="20"/>
+        </w:rPr>
+        <w:t xml:space="preserve">Fatih Karaca — </w:t>
+      </w:r>
+      <w:r>
+        <w:rPr>
+          <w:rFonts w:ascii="Courier New" w:cs="Courier New" w:eastAsia="Courier New" w:hAnsi="Courier New"/>
           <w:b/>
           <w:bCs/>
           <w:i w:val="false"/>
@@ -145,8 +157,14 @@
           <w:highlight w:val="yellow"/>
           <w:highlightCs w:val="yellow"/>
         </w:rPr>
-        <w:t xml:space="preserve">[Ad Soyad — Öğrenci No]</w:t>
-      </w:r>
+        <w:t xml:space="preserve">[Öğrenci No]</w:t>
+      </w:r>
+    </w:p>
+    <w:p>
+      <w:pPr>
+        <w:spacing w:after="20" w:before="0" w:line="264"/>
+        <w:jc w:val="center"/>
+      </w:pPr>
       <w:r>
         <w:rPr>
           <w:rFonts w:ascii="Courier New" w:cs="Courier New" w:eastAsia="Courier New" w:hAnsi="Courier New"/>
@@ -157,14 +175,8 @@
           <w:sz w:val="20"/>
           <w:szCs w:val="20"/>
         </w:rPr>
-        <w:t xml:space="preserve">   </w:t>
-      </w:r>
-    </w:p>
-    <w:p>
-      <w:pPr>
-        <w:spacing w:after="20" w:before="0" w:line="264"/>
-        <w:jc w:val="center"/>
-      </w:pPr>
+        <w:t xml:space="preserve">Şeyma Keser — </w:t>
+      </w:r>
       <w:r>
         <w:rPr>
           <w:rFonts w:ascii="Courier New" w:cs="Courier New" w:eastAsia="Courier New" w:hAnsi="Courier New"/>
@@ -177,14 +189,26 @@
           <w:highlight w:val="yellow"/>
           <w:highlightCs w:val="yellow"/>
         </w:rPr>
-        <w:t xml:space="preserve">[Ad Soyad — Öğrenci No]</w:t>
-      </w:r>
-    </w:p>
-    <w:p>
-      <w:pPr>
-        <w:spacing w:after="400" w:before="0" w:line="264"/>
+        <w:t xml:space="preserve">[Öğrenci No]</w:t>
+      </w:r>
+    </w:p>
+    <w:p>
+      <w:pPr>
+        <w:spacing w:after="20" w:before="0" w:line="264"/>
         <w:jc w:val="center"/>
       </w:pPr>
+      <w:r>
+        <w:rPr>
+          <w:rFonts w:ascii="Courier New" w:cs="Courier New" w:eastAsia="Courier New" w:hAnsi="Courier New"/>
+          <w:b w:val="false"/>
+          <w:bCs w:val="false"/>
+          <w:i w:val="false"/>
+          <w:iCs w:val="false"/>
+          <w:sz w:val="20"/>
+          <w:szCs w:val="20"/>
+        </w:rPr>
+        <w:t xml:space="preserve">Senanur Binek — </w:t>
+      </w:r>
       <w:r>
         <w:rPr>
           <w:rFonts w:ascii="Courier New" w:cs="Courier New" w:eastAsia="Courier New" w:hAnsi="Courier New"/>
@@ -197,7 +221,39 @@
           <w:highlight w:val="yellow"/>
           <w:highlightCs w:val="yellow"/>
         </w:rPr>
-        <w:t xml:space="preserve">[Ad Soyad — Öğrenci No]</w:t>
+        <w:t xml:space="preserve">[Öğrenci No]</w:t>
+      </w:r>
+    </w:p>
+    <w:p>
+      <w:pPr>
+        <w:spacing w:after="400" w:before="0" w:line="264"/>
+        <w:jc w:val="center"/>
+      </w:pPr>
+      <w:r>
+        <w:rPr>
+          <w:rFonts w:ascii="Courier New" w:cs="Courier New" w:eastAsia="Courier New" w:hAnsi="Courier New"/>
+          <w:b w:val="false"/>
+          <w:bCs w:val="false"/>
+          <w:i w:val="false"/>
+          <w:iCs w:val="false"/>
+          <w:sz w:val="20"/>
+          <w:szCs w:val="20"/>
+        </w:rPr>
+        <w:t xml:space="preserve">Recep Sami Yeşersin — </w:t>
+      </w:r>
+      <w:r>
+        <w:rPr>
+          <w:rFonts w:ascii="Courier New" w:cs="Courier New" w:eastAsia="Courier New" w:hAnsi="Courier New"/>
+          <w:b/>
+          <w:bCs/>
+          <w:i w:val="false"/>
+          <w:iCs w:val="false"/>
+          <w:sz w:val="20"/>
+          <w:szCs w:val="20"/>
+          <w:highlight w:val="yellow"/>
+          <w:highlightCs w:val="yellow"/>
+        </w:rPr>
+        <w:t xml:space="preserve">[Öğrenci No]</w:t>
       </w:r>
     </w:p>
     <w:p>
@@ -6772,21 +6828,7 @@
           <w:sz w:val="20"/>
           <w:szCs w:val="20"/>
         </w:rPr>
-        <w:t xml:space="preserve">Aşağıdaki RACI matrisi takım içi iş bölümünü göstermektedir (R=Sorumlu, A=Onaylayan, C=Danışılan, I=Bilgilendirilen). Üye adları ve harfler takımca doldurulacaktır (PÇ12, PÇ13): </w:t>
-      </w:r>
-      <w:r>
-        <w:rPr>
-          <w:rFonts w:ascii="Courier New" w:cs="Courier New" w:eastAsia="Courier New" w:hAnsi="Courier New"/>
-          <w:b/>
-          <w:bCs/>
-          <w:i w:val="false"/>
-          <w:iCs w:val="false"/>
-          <w:sz w:val="20"/>
-          <w:szCs w:val="20"/>
-          <w:highlight w:val="yellow"/>
-          <w:highlightCs w:val="yellow"/>
-        </w:rPr>
-        <w:t xml:space="preserve">[üyeleri yazın]</w:t>
+        <w:t xml:space="preserve">Takım içi iş bölümü Tablo 5.1'deki RACI matrisi ile gösterilmiştir (R = Sorumlu/yürüten, A = Onaylayan/gözden geçiren, C = Danışılan, I = Bilgilendirilen). Her iş paketinde dört rol de birer üyeye atanmış ve her üye en az bir pakette doğrudan sorumlu (R) olacak biçimde yük dengeli dağıtılmıştır. Üyeler: Fatih Karaca, Şeyma Keser, Senanur Binek ve Recep Sami Yeşersin (PÇ12, PÇ13).</w:t>
       </w:r>
     </w:p>
     <w:tbl>
@@ -6803,9 +6845,10 @@
       </w:tblPr>
       <w:tblGrid>
         <w:gridCol w:w="3360"/>
-        <w:gridCol w:w="2000"/>
-        <w:gridCol w:w="2000"/>
-        <w:gridCol w:w="2000"/>
+        <w:gridCol w:w="1500"/>
+        <w:gridCol w:w="1500"/>
+        <w:gridCol w:w="1500"/>
+        <w:gridCol w:w="1500"/>
       </w:tblGrid>
       <w:tr>
         <w:trPr>
@@ -6848,7 +6891,7 @@
         </w:tc>
         <w:tc>
           <w:tcPr>
-            <w:tcW w:type="dxa" w:w="2000"/>
+            <w:tcW w:type="dxa" w:w="1500"/>
             <w:tcBorders>
               <w:top w:val="single" w:color="BFBFBF" w:sz="1"/>
               <w:left w:val="single" w:color="BFBFBF" w:sz="1"/>
@@ -6877,13 +6920,13 @@
                 <w:sz w:val="18"/>
                 <w:szCs w:val="18"/>
               </w:rPr>
-              <w:t xml:space="preserve">Üye 1</w:t>
-            </w:r>
-          </w:p>
-        </w:tc>
-        <w:tc>
-          <w:tcPr>
-            <w:tcW w:type="dxa" w:w="2000"/>
+              <w:t xml:space="preserve">Fatih</w:t>
+            </w:r>
+          </w:p>
+        </w:tc>
+        <w:tc>
+          <w:tcPr>
+            <w:tcW w:type="dxa" w:w="1500"/>
             <w:tcBorders>
               <w:top w:val="single" w:color="BFBFBF" w:sz="1"/>
               <w:left w:val="single" w:color="BFBFBF" w:sz="1"/>
@@ -6912,13 +6955,13 @@
                 <w:sz w:val="18"/>
                 <w:szCs w:val="18"/>
               </w:rPr>
-              <w:t xml:space="preserve">Üye 2</w:t>
-            </w:r>
-          </w:p>
-        </w:tc>
-        <w:tc>
-          <w:tcPr>
-            <w:tcW w:type="dxa" w:w="2000"/>
+              <w:t xml:space="preserve">Şeyma</w:t>
+            </w:r>
+          </w:p>
+        </w:tc>
+        <w:tc>
+          <w:tcPr>
+            <w:tcW w:type="dxa" w:w="1500"/>
             <w:tcBorders>
               <w:top w:val="single" w:color="BFBFBF" w:sz="1"/>
               <w:left w:val="single" w:color="BFBFBF" w:sz="1"/>
@@ -6947,7 +6990,42 @@
                 <w:sz w:val="18"/>
                 <w:szCs w:val="18"/>
               </w:rPr>
-              <w:t xml:space="preserve">Üye 3</w:t>
+              <w:t xml:space="preserve">Senanur</w:t>
+            </w:r>
+          </w:p>
+        </w:tc>
+        <w:tc>
+          <w:tcPr>
+            <w:tcW w:type="dxa" w:w="1500"/>
+            <w:tcBorders>
+              <w:top w:val="single" w:color="BFBFBF" w:sz="1"/>
+              <w:left w:val="single" w:color="BFBFBF" w:sz="1"/>
+              <w:bottom w:val="single" w:color="BFBFBF" w:sz="1"/>
+              <w:right w:val="single" w:color="BFBFBF" w:sz="1"/>
+            </w:tcBorders>
+            <w:shd w:fill="D9E2F3" w:val="clear"/>
+            <w:tcMar>
+              <w:top w:type="dxa" w:w="50"/>
+              <w:left w:type="dxa" w:w="90"/>
+              <w:bottom w:type="dxa" w:w="50"/>
+              <w:right w:type="dxa" w:w="90"/>
+            </w:tcMar>
+          </w:tcPr>
+          <w:p>
+            <w:pPr>
+              <w:spacing w:after="0" w:line="230"/>
+            </w:pPr>
+            <w:r>
+              <w:rPr>
+                <w:rFonts w:ascii="Courier New" w:cs="Courier New" w:eastAsia="Courier New" w:hAnsi="Courier New"/>
+                <w:b/>
+                <w:bCs/>
+                <w:i w:val="false"/>
+                <w:iCs w:val="false"/>
+                <w:sz w:val="18"/>
+                <w:szCs w:val="18"/>
+              </w:rPr>
+              <w:t xml:space="preserve">Recep Sami</w:t>
             </w:r>
           </w:p>
         </w:tc>
@@ -6992,103 +7070,137 @@
         </w:tc>
         <w:tc>
           <w:tcPr>
-            <w:tcW w:type="dxa" w:w="2000"/>
-            <w:tcBorders>
-              <w:top w:val="single" w:color="BFBFBF" w:sz="1"/>
-              <w:left w:val="single" w:color="BFBFBF" w:sz="1"/>
-              <w:bottom w:val="single" w:color="BFBFBF" w:sz="1"/>
-              <w:right w:val="single" w:color="BFBFBF" w:sz="1"/>
-            </w:tcBorders>
-            <w:tcMar>
-              <w:top w:type="dxa" w:w="50"/>
-              <w:left w:type="dxa" w:w="90"/>
-              <w:bottom w:type="dxa" w:w="50"/>
-              <w:right w:type="dxa" w:w="90"/>
-            </w:tcMar>
-          </w:tcPr>
-          <w:p>
-            <w:pPr>
-              <w:spacing w:after="0" w:line="230"/>
-            </w:pPr>
-            <w:r>
-              <w:rPr>
-                <w:rFonts w:ascii="Courier New" w:cs="Courier New" w:eastAsia="Courier New" w:hAnsi="Courier New"/>
-                <w:b/>
-                <w:bCs/>
-                <w:sz w:val="18"/>
-                <w:szCs w:val="18"/>
-                <w:highlight w:val="yellow"/>
-                <w:highlightCs w:val="yellow"/>
-              </w:rPr>
-              <w:t xml:space="preserve">[…]</w:t>
-            </w:r>
-          </w:p>
-        </w:tc>
-        <w:tc>
-          <w:tcPr>
-            <w:tcW w:type="dxa" w:w="2000"/>
-            <w:tcBorders>
-              <w:top w:val="single" w:color="BFBFBF" w:sz="1"/>
-              <w:left w:val="single" w:color="BFBFBF" w:sz="1"/>
-              <w:bottom w:val="single" w:color="BFBFBF" w:sz="1"/>
-              <w:right w:val="single" w:color="BFBFBF" w:sz="1"/>
-            </w:tcBorders>
-            <w:tcMar>
-              <w:top w:type="dxa" w:w="50"/>
-              <w:left w:type="dxa" w:w="90"/>
-              <w:bottom w:type="dxa" w:w="50"/>
-              <w:right w:type="dxa" w:w="90"/>
-            </w:tcMar>
-          </w:tcPr>
-          <w:p>
-            <w:pPr>
-              <w:spacing w:after="0" w:line="230"/>
-            </w:pPr>
-            <w:r>
-              <w:rPr>
-                <w:rFonts w:ascii="Courier New" w:cs="Courier New" w:eastAsia="Courier New" w:hAnsi="Courier New"/>
-                <w:b/>
-                <w:bCs/>
-                <w:sz w:val="18"/>
-                <w:szCs w:val="18"/>
-                <w:highlight w:val="yellow"/>
-                <w:highlightCs w:val="yellow"/>
-              </w:rPr>
-              <w:t xml:space="preserve">[…]</w:t>
-            </w:r>
-          </w:p>
-        </w:tc>
-        <w:tc>
-          <w:tcPr>
-            <w:tcW w:type="dxa" w:w="2000"/>
-            <w:tcBorders>
-              <w:top w:val="single" w:color="BFBFBF" w:sz="1"/>
-              <w:left w:val="single" w:color="BFBFBF" w:sz="1"/>
-              <w:bottom w:val="single" w:color="BFBFBF" w:sz="1"/>
-              <w:right w:val="single" w:color="BFBFBF" w:sz="1"/>
-            </w:tcBorders>
-            <w:tcMar>
-              <w:top w:type="dxa" w:w="50"/>
-              <w:left w:type="dxa" w:w="90"/>
-              <w:bottom w:type="dxa" w:w="50"/>
-              <w:right w:type="dxa" w:w="90"/>
-            </w:tcMar>
-          </w:tcPr>
-          <w:p>
-            <w:pPr>
-              <w:spacing w:after="0" w:line="230"/>
-            </w:pPr>
-            <w:r>
-              <w:rPr>
-                <w:rFonts w:ascii="Courier New" w:cs="Courier New" w:eastAsia="Courier New" w:hAnsi="Courier New"/>
-                <w:b/>
-                <w:bCs/>
-                <w:sz w:val="18"/>
-                <w:szCs w:val="18"/>
-                <w:highlight w:val="yellow"/>
-                <w:highlightCs w:val="yellow"/>
-              </w:rPr>
-              <w:t xml:space="preserve">[…]</w:t>
+            <w:tcW w:type="dxa" w:w="1500"/>
+            <w:tcBorders>
+              <w:top w:val="single" w:color="BFBFBF" w:sz="1"/>
+              <w:left w:val="single" w:color="BFBFBF" w:sz="1"/>
+              <w:bottom w:val="single" w:color="BFBFBF" w:sz="1"/>
+              <w:right w:val="single" w:color="BFBFBF" w:sz="1"/>
+            </w:tcBorders>
+            <w:tcMar>
+              <w:top w:type="dxa" w:w="50"/>
+              <w:left w:type="dxa" w:w="90"/>
+              <w:bottom w:type="dxa" w:w="50"/>
+              <w:right w:type="dxa" w:w="90"/>
+            </w:tcMar>
+          </w:tcPr>
+          <w:p>
+            <w:pPr>
+              <w:spacing w:after="0" w:line="230"/>
+            </w:pPr>
+            <w:r>
+              <w:rPr>
+                <w:rFonts w:ascii="Courier New" w:cs="Courier New" w:eastAsia="Courier New" w:hAnsi="Courier New"/>
+                <w:b w:val="false"/>
+                <w:bCs w:val="false"/>
+                <w:i w:val="false"/>
+                <w:iCs w:val="false"/>
+                <w:sz w:val="18"/>
+                <w:szCs w:val="18"/>
+              </w:rPr>
+              <w:t xml:space="preserve">R</w:t>
+            </w:r>
+          </w:p>
+        </w:tc>
+        <w:tc>
+          <w:tcPr>
+            <w:tcW w:type="dxa" w:w="1500"/>
+            <w:tcBorders>
+              <w:top w:val="single" w:color="BFBFBF" w:sz="1"/>
+              <w:left w:val="single" w:color="BFBFBF" w:sz="1"/>
+              <w:bottom w:val="single" w:color="BFBFBF" w:sz="1"/>
+              <w:right w:val="single" w:color="BFBFBF" w:sz="1"/>
+            </w:tcBorders>
+            <w:tcMar>
+              <w:top w:type="dxa" w:w="50"/>
+              <w:left w:type="dxa" w:w="90"/>
+              <w:bottom w:type="dxa" w:w="50"/>
+              <w:right w:type="dxa" w:w="90"/>
+            </w:tcMar>
+          </w:tcPr>
+          <w:p>
+            <w:pPr>
+              <w:spacing w:after="0" w:line="230"/>
+            </w:pPr>
+            <w:r>
+              <w:rPr>
+                <w:rFonts w:ascii="Courier New" w:cs="Courier New" w:eastAsia="Courier New" w:hAnsi="Courier New"/>
+                <w:b w:val="false"/>
+                <w:bCs w:val="false"/>
+                <w:i w:val="false"/>
+                <w:iCs w:val="false"/>
+                <w:sz w:val="18"/>
+                <w:szCs w:val="18"/>
+              </w:rPr>
+              <w:t xml:space="preserve">A</w:t>
+            </w:r>
+          </w:p>
+        </w:tc>
+        <w:tc>
+          <w:tcPr>
+            <w:tcW w:type="dxa" w:w="1500"/>
+            <w:tcBorders>
+              <w:top w:val="single" w:color="BFBFBF" w:sz="1"/>
+              <w:left w:val="single" w:color="BFBFBF" w:sz="1"/>
+              <w:bottom w:val="single" w:color="BFBFBF" w:sz="1"/>
+              <w:right w:val="single" w:color="BFBFBF" w:sz="1"/>
+            </w:tcBorders>
+            <w:tcMar>
+              <w:top w:type="dxa" w:w="50"/>
+              <w:left w:type="dxa" w:w="90"/>
+              <w:bottom w:type="dxa" w:w="50"/>
+              <w:right w:type="dxa" w:w="90"/>
+            </w:tcMar>
+          </w:tcPr>
+          <w:p>
+            <w:pPr>
+              <w:spacing w:after="0" w:line="230"/>
+            </w:pPr>
+            <w:r>
+              <w:rPr>
+                <w:rFonts w:ascii="Courier New" w:cs="Courier New" w:eastAsia="Courier New" w:hAnsi="Courier New"/>
+                <w:b w:val="false"/>
+                <w:bCs w:val="false"/>
+                <w:i w:val="false"/>
+                <w:iCs w:val="false"/>
+                <w:sz w:val="18"/>
+                <w:szCs w:val="18"/>
+              </w:rPr>
+              <w:t xml:space="preserve">C</w:t>
+            </w:r>
+          </w:p>
+        </w:tc>
+        <w:tc>
+          <w:tcPr>
+            <w:tcW w:type="dxa" w:w="1500"/>
+            <w:tcBorders>
+              <w:top w:val="single" w:color="BFBFBF" w:sz="1"/>
+              <w:left w:val="single" w:color="BFBFBF" w:sz="1"/>
+              <w:bottom w:val="single" w:color="BFBFBF" w:sz="1"/>
+              <w:right w:val="single" w:color="BFBFBF" w:sz="1"/>
+            </w:tcBorders>
+            <w:tcMar>
+              <w:top w:type="dxa" w:w="50"/>
+              <w:left w:type="dxa" w:w="90"/>
+              <w:bottom w:type="dxa" w:w="50"/>
+              <w:right w:type="dxa" w:w="90"/>
+            </w:tcMar>
+          </w:tcPr>
+          <w:p>
+            <w:pPr>
+              <w:spacing w:after="0" w:line="230"/>
+            </w:pPr>
+            <w:r>
+              <w:rPr>
+                <w:rFonts w:ascii="Courier New" w:cs="Courier New" w:eastAsia="Courier New" w:hAnsi="Courier New"/>
+                <w:b w:val="false"/>
+                <w:bCs w:val="false"/>
+                <w:i w:val="false"/>
+                <w:iCs w:val="false"/>
+                <w:sz w:val="18"/>
+                <w:szCs w:val="18"/>
+              </w:rPr>
+              <w:t xml:space="preserve">I</w:t>
             </w:r>
           </w:p>
         </w:tc>
@@ -7133,103 +7245,137 @@
         </w:tc>
         <w:tc>
           <w:tcPr>
-            <w:tcW w:type="dxa" w:w="2000"/>
-            <w:tcBorders>
-              <w:top w:val="single" w:color="BFBFBF" w:sz="1"/>
-              <w:left w:val="single" w:color="BFBFBF" w:sz="1"/>
-              <w:bottom w:val="single" w:color="BFBFBF" w:sz="1"/>
-              <w:right w:val="single" w:color="BFBFBF" w:sz="1"/>
-            </w:tcBorders>
-            <w:tcMar>
-              <w:top w:type="dxa" w:w="50"/>
-              <w:left w:type="dxa" w:w="90"/>
-              <w:bottom w:type="dxa" w:w="50"/>
-              <w:right w:type="dxa" w:w="90"/>
-            </w:tcMar>
-          </w:tcPr>
-          <w:p>
-            <w:pPr>
-              <w:spacing w:after="0" w:line="230"/>
-            </w:pPr>
-            <w:r>
-              <w:rPr>
-                <w:rFonts w:ascii="Courier New" w:cs="Courier New" w:eastAsia="Courier New" w:hAnsi="Courier New"/>
-                <w:b/>
-                <w:bCs/>
-                <w:sz w:val="18"/>
-                <w:szCs w:val="18"/>
-                <w:highlight w:val="yellow"/>
-                <w:highlightCs w:val="yellow"/>
-              </w:rPr>
-              <w:t xml:space="preserve">[…]</w:t>
-            </w:r>
-          </w:p>
-        </w:tc>
-        <w:tc>
-          <w:tcPr>
-            <w:tcW w:type="dxa" w:w="2000"/>
-            <w:tcBorders>
-              <w:top w:val="single" w:color="BFBFBF" w:sz="1"/>
-              <w:left w:val="single" w:color="BFBFBF" w:sz="1"/>
-              <w:bottom w:val="single" w:color="BFBFBF" w:sz="1"/>
-              <w:right w:val="single" w:color="BFBFBF" w:sz="1"/>
-            </w:tcBorders>
-            <w:tcMar>
-              <w:top w:type="dxa" w:w="50"/>
-              <w:left w:type="dxa" w:w="90"/>
-              <w:bottom w:type="dxa" w:w="50"/>
-              <w:right w:type="dxa" w:w="90"/>
-            </w:tcMar>
-          </w:tcPr>
-          <w:p>
-            <w:pPr>
-              <w:spacing w:after="0" w:line="230"/>
-            </w:pPr>
-            <w:r>
-              <w:rPr>
-                <w:rFonts w:ascii="Courier New" w:cs="Courier New" w:eastAsia="Courier New" w:hAnsi="Courier New"/>
-                <w:b/>
-                <w:bCs/>
-                <w:sz w:val="18"/>
-                <w:szCs w:val="18"/>
-                <w:highlight w:val="yellow"/>
-                <w:highlightCs w:val="yellow"/>
-              </w:rPr>
-              <w:t xml:space="preserve">[…]</w:t>
-            </w:r>
-          </w:p>
-        </w:tc>
-        <w:tc>
-          <w:tcPr>
-            <w:tcW w:type="dxa" w:w="2000"/>
-            <w:tcBorders>
-              <w:top w:val="single" w:color="BFBFBF" w:sz="1"/>
-              <w:left w:val="single" w:color="BFBFBF" w:sz="1"/>
-              <w:bottom w:val="single" w:color="BFBFBF" w:sz="1"/>
-              <w:right w:val="single" w:color="BFBFBF" w:sz="1"/>
-            </w:tcBorders>
-            <w:tcMar>
-              <w:top w:type="dxa" w:w="50"/>
-              <w:left w:type="dxa" w:w="90"/>
-              <w:bottom w:type="dxa" w:w="50"/>
-              <w:right w:type="dxa" w:w="90"/>
-            </w:tcMar>
-          </w:tcPr>
-          <w:p>
-            <w:pPr>
-              <w:spacing w:after="0" w:line="230"/>
-            </w:pPr>
-            <w:r>
-              <w:rPr>
-                <w:rFonts w:ascii="Courier New" w:cs="Courier New" w:eastAsia="Courier New" w:hAnsi="Courier New"/>
-                <w:b/>
-                <w:bCs/>
-                <w:sz w:val="18"/>
-                <w:szCs w:val="18"/>
-                <w:highlight w:val="yellow"/>
-                <w:highlightCs w:val="yellow"/>
-              </w:rPr>
-              <w:t xml:space="preserve">[…]</w:t>
+            <w:tcW w:type="dxa" w:w="1500"/>
+            <w:tcBorders>
+              <w:top w:val="single" w:color="BFBFBF" w:sz="1"/>
+              <w:left w:val="single" w:color="BFBFBF" w:sz="1"/>
+              <w:bottom w:val="single" w:color="BFBFBF" w:sz="1"/>
+              <w:right w:val="single" w:color="BFBFBF" w:sz="1"/>
+            </w:tcBorders>
+            <w:tcMar>
+              <w:top w:type="dxa" w:w="50"/>
+              <w:left w:type="dxa" w:w="90"/>
+              <w:bottom w:type="dxa" w:w="50"/>
+              <w:right w:type="dxa" w:w="90"/>
+            </w:tcMar>
+          </w:tcPr>
+          <w:p>
+            <w:pPr>
+              <w:spacing w:after="0" w:line="230"/>
+            </w:pPr>
+            <w:r>
+              <w:rPr>
+                <w:rFonts w:ascii="Courier New" w:cs="Courier New" w:eastAsia="Courier New" w:hAnsi="Courier New"/>
+                <w:b w:val="false"/>
+                <w:bCs w:val="false"/>
+                <w:i w:val="false"/>
+                <w:iCs w:val="false"/>
+                <w:sz w:val="18"/>
+                <w:szCs w:val="18"/>
+              </w:rPr>
+              <w:t xml:space="preserve">C</w:t>
+            </w:r>
+          </w:p>
+        </w:tc>
+        <w:tc>
+          <w:tcPr>
+            <w:tcW w:type="dxa" w:w="1500"/>
+            <w:tcBorders>
+              <w:top w:val="single" w:color="BFBFBF" w:sz="1"/>
+              <w:left w:val="single" w:color="BFBFBF" w:sz="1"/>
+              <w:bottom w:val="single" w:color="BFBFBF" w:sz="1"/>
+              <w:right w:val="single" w:color="BFBFBF" w:sz="1"/>
+            </w:tcBorders>
+            <w:tcMar>
+              <w:top w:type="dxa" w:w="50"/>
+              <w:left w:type="dxa" w:w="90"/>
+              <w:bottom w:type="dxa" w:w="50"/>
+              <w:right w:type="dxa" w:w="90"/>
+            </w:tcMar>
+          </w:tcPr>
+          <w:p>
+            <w:pPr>
+              <w:spacing w:after="0" w:line="230"/>
+            </w:pPr>
+            <w:r>
+              <w:rPr>
+                <w:rFonts w:ascii="Courier New" w:cs="Courier New" w:eastAsia="Courier New" w:hAnsi="Courier New"/>
+                <w:b w:val="false"/>
+                <w:bCs w:val="false"/>
+                <w:i w:val="false"/>
+                <w:iCs w:val="false"/>
+                <w:sz w:val="18"/>
+                <w:szCs w:val="18"/>
+              </w:rPr>
+              <w:t xml:space="preserve">I</w:t>
+            </w:r>
+          </w:p>
+        </w:tc>
+        <w:tc>
+          <w:tcPr>
+            <w:tcW w:type="dxa" w:w="1500"/>
+            <w:tcBorders>
+              <w:top w:val="single" w:color="BFBFBF" w:sz="1"/>
+              <w:left w:val="single" w:color="BFBFBF" w:sz="1"/>
+              <w:bottom w:val="single" w:color="BFBFBF" w:sz="1"/>
+              <w:right w:val="single" w:color="BFBFBF" w:sz="1"/>
+            </w:tcBorders>
+            <w:tcMar>
+              <w:top w:type="dxa" w:w="50"/>
+              <w:left w:type="dxa" w:w="90"/>
+              <w:bottom w:type="dxa" w:w="50"/>
+              <w:right w:type="dxa" w:w="90"/>
+            </w:tcMar>
+          </w:tcPr>
+          <w:p>
+            <w:pPr>
+              <w:spacing w:after="0" w:line="230"/>
+            </w:pPr>
+            <w:r>
+              <w:rPr>
+                <w:rFonts w:ascii="Courier New" w:cs="Courier New" w:eastAsia="Courier New" w:hAnsi="Courier New"/>
+                <w:b w:val="false"/>
+                <w:bCs w:val="false"/>
+                <w:i w:val="false"/>
+                <w:iCs w:val="false"/>
+                <w:sz w:val="18"/>
+                <w:szCs w:val="18"/>
+              </w:rPr>
+              <w:t xml:space="preserve">R</w:t>
+            </w:r>
+          </w:p>
+        </w:tc>
+        <w:tc>
+          <w:tcPr>
+            <w:tcW w:type="dxa" w:w="1500"/>
+            <w:tcBorders>
+              <w:top w:val="single" w:color="BFBFBF" w:sz="1"/>
+              <w:left w:val="single" w:color="BFBFBF" w:sz="1"/>
+              <w:bottom w:val="single" w:color="BFBFBF" w:sz="1"/>
+              <w:right w:val="single" w:color="BFBFBF" w:sz="1"/>
+            </w:tcBorders>
+            <w:tcMar>
+              <w:top w:type="dxa" w:w="50"/>
+              <w:left w:type="dxa" w:w="90"/>
+              <w:bottom w:type="dxa" w:w="50"/>
+              <w:right w:type="dxa" w:w="90"/>
+            </w:tcMar>
+          </w:tcPr>
+          <w:p>
+            <w:pPr>
+              <w:spacing w:after="0" w:line="230"/>
+            </w:pPr>
+            <w:r>
+              <w:rPr>
+                <w:rFonts w:ascii="Courier New" w:cs="Courier New" w:eastAsia="Courier New" w:hAnsi="Courier New"/>
+                <w:b w:val="false"/>
+                <w:bCs w:val="false"/>
+                <w:i w:val="false"/>
+                <w:iCs w:val="false"/>
+                <w:sz w:val="18"/>
+                <w:szCs w:val="18"/>
+              </w:rPr>
+              <w:t xml:space="preserve">A</w:t>
             </w:r>
           </w:p>
         </w:tc>
@@ -7268,109 +7414,143 @@
                 <w:sz w:val="18"/>
                 <w:szCs w:val="18"/>
               </w:rPr>
-              <w:t xml:space="preserve">UART/SoC (Verilog)</w:t>
-            </w:r>
-          </w:p>
-        </w:tc>
-        <w:tc>
-          <w:tcPr>
-            <w:tcW w:type="dxa" w:w="2000"/>
-            <w:tcBorders>
-              <w:top w:val="single" w:color="BFBFBF" w:sz="1"/>
-              <w:left w:val="single" w:color="BFBFBF" w:sz="1"/>
-              <w:bottom w:val="single" w:color="BFBFBF" w:sz="1"/>
-              <w:right w:val="single" w:color="BFBFBF" w:sz="1"/>
-            </w:tcBorders>
-            <w:tcMar>
-              <w:top w:type="dxa" w:w="50"/>
-              <w:left w:type="dxa" w:w="90"/>
-              <w:bottom w:type="dxa" w:w="50"/>
-              <w:right w:type="dxa" w:w="90"/>
-            </w:tcMar>
-          </w:tcPr>
-          <w:p>
-            <w:pPr>
-              <w:spacing w:after="0" w:line="230"/>
-            </w:pPr>
-            <w:r>
-              <w:rPr>
-                <w:rFonts w:ascii="Courier New" w:cs="Courier New" w:eastAsia="Courier New" w:hAnsi="Courier New"/>
-                <w:b/>
-                <w:bCs/>
-                <w:sz w:val="18"/>
-                <w:szCs w:val="18"/>
-                <w:highlight w:val="yellow"/>
-                <w:highlightCs w:val="yellow"/>
-              </w:rPr>
-              <w:t xml:space="preserve">[…]</w:t>
-            </w:r>
-          </w:p>
-        </w:tc>
-        <w:tc>
-          <w:tcPr>
-            <w:tcW w:type="dxa" w:w="2000"/>
-            <w:tcBorders>
-              <w:top w:val="single" w:color="BFBFBF" w:sz="1"/>
-              <w:left w:val="single" w:color="BFBFBF" w:sz="1"/>
-              <w:bottom w:val="single" w:color="BFBFBF" w:sz="1"/>
-              <w:right w:val="single" w:color="BFBFBF" w:sz="1"/>
-            </w:tcBorders>
-            <w:tcMar>
-              <w:top w:type="dxa" w:w="50"/>
-              <w:left w:type="dxa" w:w="90"/>
-              <w:bottom w:type="dxa" w:w="50"/>
-              <w:right w:type="dxa" w:w="90"/>
-            </w:tcMar>
-          </w:tcPr>
-          <w:p>
-            <w:pPr>
-              <w:spacing w:after="0" w:line="230"/>
-            </w:pPr>
-            <w:r>
-              <w:rPr>
-                <w:rFonts w:ascii="Courier New" w:cs="Courier New" w:eastAsia="Courier New" w:hAnsi="Courier New"/>
-                <w:b/>
-                <w:bCs/>
-                <w:sz w:val="18"/>
-                <w:szCs w:val="18"/>
-                <w:highlight w:val="yellow"/>
-                <w:highlightCs w:val="yellow"/>
-              </w:rPr>
-              <w:t xml:space="preserve">[…]</w:t>
-            </w:r>
-          </w:p>
-        </w:tc>
-        <w:tc>
-          <w:tcPr>
-            <w:tcW w:type="dxa" w:w="2000"/>
-            <w:tcBorders>
-              <w:top w:val="single" w:color="BFBFBF" w:sz="1"/>
-              <w:left w:val="single" w:color="BFBFBF" w:sz="1"/>
-              <w:bottom w:val="single" w:color="BFBFBF" w:sz="1"/>
-              <w:right w:val="single" w:color="BFBFBF" w:sz="1"/>
-            </w:tcBorders>
-            <w:tcMar>
-              <w:top w:type="dxa" w:w="50"/>
-              <w:left w:type="dxa" w:w="90"/>
-              <w:bottom w:type="dxa" w:w="50"/>
-              <w:right w:type="dxa" w:w="90"/>
-            </w:tcMar>
-          </w:tcPr>
-          <w:p>
-            <w:pPr>
-              <w:spacing w:after="0" w:line="230"/>
-            </w:pPr>
-            <w:r>
-              <w:rPr>
-                <w:rFonts w:ascii="Courier New" w:cs="Courier New" w:eastAsia="Courier New" w:hAnsi="Courier New"/>
-                <w:b/>
-                <w:bCs/>
-                <w:sz w:val="18"/>
-                <w:szCs w:val="18"/>
-                <w:highlight w:val="yellow"/>
-                <w:highlightCs w:val="yellow"/>
-              </w:rPr>
-              <w:t xml:space="preserve">[…]</w:t>
+              <w:t xml:space="preserve">UART / SoC (Verilog)</w:t>
+            </w:r>
+          </w:p>
+        </w:tc>
+        <w:tc>
+          <w:tcPr>
+            <w:tcW w:type="dxa" w:w="1500"/>
+            <w:tcBorders>
+              <w:top w:val="single" w:color="BFBFBF" w:sz="1"/>
+              <w:left w:val="single" w:color="BFBFBF" w:sz="1"/>
+              <w:bottom w:val="single" w:color="BFBFBF" w:sz="1"/>
+              <w:right w:val="single" w:color="BFBFBF" w:sz="1"/>
+            </w:tcBorders>
+            <w:tcMar>
+              <w:top w:type="dxa" w:w="50"/>
+              <w:left w:type="dxa" w:w="90"/>
+              <w:bottom w:type="dxa" w:w="50"/>
+              <w:right w:type="dxa" w:w="90"/>
+            </w:tcMar>
+          </w:tcPr>
+          <w:p>
+            <w:pPr>
+              <w:spacing w:after="0" w:line="230"/>
+            </w:pPr>
+            <w:r>
+              <w:rPr>
+                <w:rFonts w:ascii="Courier New" w:cs="Courier New" w:eastAsia="Courier New" w:hAnsi="Courier New"/>
+                <w:b w:val="false"/>
+                <w:bCs w:val="false"/>
+                <w:i w:val="false"/>
+                <w:iCs w:val="false"/>
+                <w:sz w:val="18"/>
+                <w:szCs w:val="18"/>
+              </w:rPr>
+              <w:t xml:space="preserve">A</w:t>
+            </w:r>
+          </w:p>
+        </w:tc>
+        <w:tc>
+          <w:tcPr>
+            <w:tcW w:type="dxa" w:w="1500"/>
+            <w:tcBorders>
+              <w:top w:val="single" w:color="BFBFBF" w:sz="1"/>
+              <w:left w:val="single" w:color="BFBFBF" w:sz="1"/>
+              <w:bottom w:val="single" w:color="BFBFBF" w:sz="1"/>
+              <w:right w:val="single" w:color="BFBFBF" w:sz="1"/>
+            </w:tcBorders>
+            <w:tcMar>
+              <w:top w:type="dxa" w:w="50"/>
+              <w:left w:type="dxa" w:w="90"/>
+              <w:bottom w:type="dxa" w:w="50"/>
+              <w:right w:type="dxa" w:w="90"/>
+            </w:tcMar>
+          </w:tcPr>
+          <w:p>
+            <w:pPr>
+              <w:spacing w:after="0" w:line="230"/>
+            </w:pPr>
+            <w:r>
+              <w:rPr>
+                <w:rFonts w:ascii="Courier New" w:cs="Courier New" w:eastAsia="Courier New" w:hAnsi="Courier New"/>
+                <w:b w:val="false"/>
+                <w:bCs w:val="false"/>
+                <w:i w:val="false"/>
+                <w:iCs w:val="false"/>
+                <w:sz w:val="18"/>
+                <w:szCs w:val="18"/>
+              </w:rPr>
+              <w:t xml:space="preserve">C</w:t>
+            </w:r>
+          </w:p>
+        </w:tc>
+        <w:tc>
+          <w:tcPr>
+            <w:tcW w:type="dxa" w:w="1500"/>
+            <w:tcBorders>
+              <w:top w:val="single" w:color="BFBFBF" w:sz="1"/>
+              <w:left w:val="single" w:color="BFBFBF" w:sz="1"/>
+              <w:bottom w:val="single" w:color="BFBFBF" w:sz="1"/>
+              <w:right w:val="single" w:color="BFBFBF" w:sz="1"/>
+            </w:tcBorders>
+            <w:tcMar>
+              <w:top w:type="dxa" w:w="50"/>
+              <w:left w:type="dxa" w:w="90"/>
+              <w:bottom w:type="dxa" w:w="50"/>
+              <w:right w:type="dxa" w:w="90"/>
+            </w:tcMar>
+          </w:tcPr>
+          <w:p>
+            <w:pPr>
+              <w:spacing w:after="0" w:line="230"/>
+            </w:pPr>
+            <w:r>
+              <w:rPr>
+                <w:rFonts w:ascii="Courier New" w:cs="Courier New" w:eastAsia="Courier New" w:hAnsi="Courier New"/>
+                <w:b w:val="false"/>
+                <w:bCs w:val="false"/>
+                <w:i w:val="false"/>
+                <w:iCs w:val="false"/>
+                <w:sz w:val="18"/>
+                <w:szCs w:val="18"/>
+              </w:rPr>
+              <w:t xml:space="preserve">I</w:t>
+            </w:r>
+          </w:p>
+        </w:tc>
+        <w:tc>
+          <w:tcPr>
+            <w:tcW w:type="dxa" w:w="1500"/>
+            <w:tcBorders>
+              <w:top w:val="single" w:color="BFBFBF" w:sz="1"/>
+              <w:left w:val="single" w:color="BFBFBF" w:sz="1"/>
+              <w:bottom w:val="single" w:color="BFBFBF" w:sz="1"/>
+              <w:right w:val="single" w:color="BFBFBF" w:sz="1"/>
+            </w:tcBorders>
+            <w:tcMar>
+              <w:top w:type="dxa" w:w="50"/>
+              <w:left w:type="dxa" w:w="90"/>
+              <w:bottom w:type="dxa" w:w="50"/>
+              <w:right w:type="dxa" w:w="90"/>
+            </w:tcMar>
+          </w:tcPr>
+          <w:p>
+            <w:pPr>
+              <w:spacing w:after="0" w:line="230"/>
+            </w:pPr>
+            <w:r>
+              <w:rPr>
+                <w:rFonts w:ascii="Courier New" w:cs="Courier New" w:eastAsia="Courier New" w:hAnsi="Courier New"/>
+                <w:b w:val="false"/>
+                <w:bCs w:val="false"/>
+                <w:i w:val="false"/>
+                <w:iCs w:val="false"/>
+                <w:sz w:val="18"/>
+                <w:szCs w:val="18"/>
+              </w:rPr>
+              <w:t xml:space="preserve">R</w:t>
             </w:r>
           </w:p>
         </w:tc>
@@ -7415,103 +7595,137 @@
         </w:tc>
         <w:tc>
           <w:tcPr>
-            <w:tcW w:type="dxa" w:w="2000"/>
-            <w:tcBorders>
-              <w:top w:val="single" w:color="BFBFBF" w:sz="1"/>
-              <w:left w:val="single" w:color="BFBFBF" w:sz="1"/>
-              <w:bottom w:val="single" w:color="BFBFBF" w:sz="1"/>
-              <w:right w:val="single" w:color="BFBFBF" w:sz="1"/>
-            </w:tcBorders>
-            <w:tcMar>
-              <w:top w:type="dxa" w:w="50"/>
-              <w:left w:type="dxa" w:w="90"/>
-              <w:bottom w:type="dxa" w:w="50"/>
-              <w:right w:type="dxa" w:w="90"/>
-            </w:tcMar>
-          </w:tcPr>
-          <w:p>
-            <w:pPr>
-              <w:spacing w:after="0" w:line="230"/>
-            </w:pPr>
-            <w:r>
-              <w:rPr>
-                <w:rFonts w:ascii="Courier New" w:cs="Courier New" w:eastAsia="Courier New" w:hAnsi="Courier New"/>
-                <w:b/>
-                <w:bCs/>
-                <w:sz w:val="18"/>
-                <w:szCs w:val="18"/>
-                <w:highlight w:val="yellow"/>
-                <w:highlightCs w:val="yellow"/>
-              </w:rPr>
-              <w:t xml:space="preserve">[…]</w:t>
-            </w:r>
-          </w:p>
-        </w:tc>
-        <w:tc>
-          <w:tcPr>
-            <w:tcW w:type="dxa" w:w="2000"/>
-            <w:tcBorders>
-              <w:top w:val="single" w:color="BFBFBF" w:sz="1"/>
-              <w:left w:val="single" w:color="BFBFBF" w:sz="1"/>
-              <w:bottom w:val="single" w:color="BFBFBF" w:sz="1"/>
-              <w:right w:val="single" w:color="BFBFBF" w:sz="1"/>
-            </w:tcBorders>
-            <w:tcMar>
-              <w:top w:type="dxa" w:w="50"/>
-              <w:left w:type="dxa" w:w="90"/>
-              <w:bottom w:type="dxa" w:w="50"/>
-              <w:right w:type="dxa" w:w="90"/>
-            </w:tcMar>
-          </w:tcPr>
-          <w:p>
-            <w:pPr>
-              <w:spacing w:after="0" w:line="230"/>
-            </w:pPr>
-            <w:r>
-              <w:rPr>
-                <w:rFonts w:ascii="Courier New" w:cs="Courier New" w:eastAsia="Courier New" w:hAnsi="Courier New"/>
-                <w:b/>
-                <w:bCs/>
-                <w:sz w:val="18"/>
-                <w:szCs w:val="18"/>
-                <w:highlight w:val="yellow"/>
-                <w:highlightCs w:val="yellow"/>
-              </w:rPr>
-              <w:t xml:space="preserve">[…]</w:t>
-            </w:r>
-          </w:p>
-        </w:tc>
-        <w:tc>
-          <w:tcPr>
-            <w:tcW w:type="dxa" w:w="2000"/>
-            <w:tcBorders>
-              <w:top w:val="single" w:color="BFBFBF" w:sz="1"/>
-              <w:left w:val="single" w:color="BFBFBF" w:sz="1"/>
-              <w:bottom w:val="single" w:color="BFBFBF" w:sz="1"/>
-              <w:right w:val="single" w:color="BFBFBF" w:sz="1"/>
-            </w:tcBorders>
-            <w:tcMar>
-              <w:top w:type="dxa" w:w="50"/>
-              <w:left w:type="dxa" w:w="90"/>
-              <w:bottom w:type="dxa" w:w="50"/>
-              <w:right w:type="dxa" w:w="90"/>
-            </w:tcMar>
-          </w:tcPr>
-          <w:p>
-            <w:pPr>
-              <w:spacing w:after="0" w:line="230"/>
-            </w:pPr>
-            <w:r>
-              <w:rPr>
-                <w:rFonts w:ascii="Courier New" w:cs="Courier New" w:eastAsia="Courier New" w:hAnsi="Courier New"/>
-                <w:b/>
-                <w:bCs/>
-                <w:sz w:val="18"/>
-                <w:szCs w:val="18"/>
-                <w:highlight w:val="yellow"/>
-                <w:highlightCs w:val="yellow"/>
-              </w:rPr>
-              <w:t xml:space="preserve">[…]</w:t>
+            <w:tcW w:type="dxa" w:w="1500"/>
+            <w:tcBorders>
+              <w:top w:val="single" w:color="BFBFBF" w:sz="1"/>
+              <w:left w:val="single" w:color="BFBFBF" w:sz="1"/>
+              <w:bottom w:val="single" w:color="BFBFBF" w:sz="1"/>
+              <w:right w:val="single" w:color="BFBFBF" w:sz="1"/>
+            </w:tcBorders>
+            <w:tcMar>
+              <w:top w:type="dxa" w:w="50"/>
+              <w:left w:type="dxa" w:w="90"/>
+              <w:bottom w:type="dxa" w:w="50"/>
+              <w:right w:type="dxa" w:w="90"/>
+            </w:tcMar>
+          </w:tcPr>
+          <w:p>
+            <w:pPr>
+              <w:spacing w:after="0" w:line="230"/>
+            </w:pPr>
+            <w:r>
+              <w:rPr>
+                <w:rFonts w:ascii="Courier New" w:cs="Courier New" w:eastAsia="Courier New" w:hAnsi="Courier New"/>
+                <w:b w:val="false"/>
+                <w:bCs w:val="false"/>
+                <w:i w:val="false"/>
+                <w:iCs w:val="false"/>
+                <w:sz w:val="18"/>
+                <w:szCs w:val="18"/>
+              </w:rPr>
+              <w:t xml:space="preserve">I</w:t>
+            </w:r>
+          </w:p>
+        </w:tc>
+        <w:tc>
+          <w:tcPr>
+            <w:tcW w:type="dxa" w:w="1500"/>
+            <w:tcBorders>
+              <w:top w:val="single" w:color="BFBFBF" w:sz="1"/>
+              <w:left w:val="single" w:color="BFBFBF" w:sz="1"/>
+              <w:bottom w:val="single" w:color="BFBFBF" w:sz="1"/>
+              <w:right w:val="single" w:color="BFBFBF" w:sz="1"/>
+            </w:tcBorders>
+            <w:tcMar>
+              <w:top w:type="dxa" w:w="50"/>
+              <w:left w:type="dxa" w:w="90"/>
+              <w:bottom w:type="dxa" w:w="50"/>
+              <w:right w:type="dxa" w:w="90"/>
+            </w:tcMar>
+          </w:tcPr>
+          <w:p>
+            <w:pPr>
+              <w:spacing w:after="0" w:line="230"/>
+            </w:pPr>
+            <w:r>
+              <w:rPr>
+                <w:rFonts w:ascii="Courier New" w:cs="Courier New" w:eastAsia="Courier New" w:hAnsi="Courier New"/>
+                <w:b w:val="false"/>
+                <w:bCs w:val="false"/>
+                <w:i w:val="false"/>
+                <w:iCs w:val="false"/>
+                <w:sz w:val="18"/>
+                <w:szCs w:val="18"/>
+              </w:rPr>
+              <w:t xml:space="preserve">R</w:t>
+            </w:r>
+          </w:p>
+        </w:tc>
+        <w:tc>
+          <w:tcPr>
+            <w:tcW w:type="dxa" w:w="1500"/>
+            <w:tcBorders>
+              <w:top w:val="single" w:color="BFBFBF" w:sz="1"/>
+              <w:left w:val="single" w:color="BFBFBF" w:sz="1"/>
+              <w:bottom w:val="single" w:color="BFBFBF" w:sz="1"/>
+              <w:right w:val="single" w:color="BFBFBF" w:sz="1"/>
+            </w:tcBorders>
+            <w:tcMar>
+              <w:top w:type="dxa" w:w="50"/>
+              <w:left w:type="dxa" w:w="90"/>
+              <w:bottom w:type="dxa" w:w="50"/>
+              <w:right w:type="dxa" w:w="90"/>
+            </w:tcMar>
+          </w:tcPr>
+          <w:p>
+            <w:pPr>
+              <w:spacing w:after="0" w:line="230"/>
+            </w:pPr>
+            <w:r>
+              <w:rPr>
+                <w:rFonts w:ascii="Courier New" w:cs="Courier New" w:eastAsia="Courier New" w:hAnsi="Courier New"/>
+                <w:b w:val="false"/>
+                <w:bCs w:val="false"/>
+                <w:i w:val="false"/>
+                <w:iCs w:val="false"/>
+                <w:sz w:val="18"/>
+                <w:szCs w:val="18"/>
+              </w:rPr>
+              <w:t xml:space="preserve">A</w:t>
+            </w:r>
+          </w:p>
+        </w:tc>
+        <w:tc>
+          <w:tcPr>
+            <w:tcW w:type="dxa" w:w="1500"/>
+            <w:tcBorders>
+              <w:top w:val="single" w:color="BFBFBF" w:sz="1"/>
+              <w:left w:val="single" w:color="BFBFBF" w:sz="1"/>
+              <w:bottom w:val="single" w:color="BFBFBF" w:sz="1"/>
+              <w:right w:val="single" w:color="BFBFBF" w:sz="1"/>
+            </w:tcBorders>
+            <w:tcMar>
+              <w:top w:type="dxa" w:w="50"/>
+              <w:left w:type="dxa" w:w="90"/>
+              <w:bottom w:type="dxa" w:w="50"/>
+              <w:right w:type="dxa" w:w="90"/>
+            </w:tcMar>
+          </w:tcPr>
+          <w:p>
+            <w:pPr>
+              <w:spacing w:after="0" w:line="230"/>
+            </w:pPr>
+            <w:r>
+              <w:rPr>
+                <w:rFonts w:ascii="Courier New" w:cs="Courier New" w:eastAsia="Courier New" w:hAnsi="Courier New"/>
+                <w:b w:val="false"/>
+                <w:bCs w:val="false"/>
+                <w:i w:val="false"/>
+                <w:iCs w:val="false"/>
+                <w:sz w:val="18"/>
+                <w:szCs w:val="18"/>
+              </w:rPr>
+              <w:t xml:space="preserve">C</w:t>
             </w:r>
           </w:p>
         </w:tc>
@@ -7556,103 +7770,137 @@
         </w:tc>
         <w:tc>
           <w:tcPr>
-            <w:tcW w:type="dxa" w:w="2000"/>
-            <w:tcBorders>
-              <w:top w:val="single" w:color="BFBFBF" w:sz="1"/>
-              <w:left w:val="single" w:color="BFBFBF" w:sz="1"/>
-              <w:bottom w:val="single" w:color="BFBFBF" w:sz="1"/>
-              <w:right w:val="single" w:color="BFBFBF" w:sz="1"/>
-            </w:tcBorders>
-            <w:tcMar>
-              <w:top w:type="dxa" w:w="50"/>
-              <w:left w:type="dxa" w:w="90"/>
-              <w:bottom w:type="dxa" w:w="50"/>
-              <w:right w:type="dxa" w:w="90"/>
-            </w:tcMar>
-          </w:tcPr>
-          <w:p>
-            <w:pPr>
-              <w:spacing w:after="0" w:line="230"/>
-            </w:pPr>
-            <w:r>
-              <w:rPr>
-                <w:rFonts w:ascii="Courier New" w:cs="Courier New" w:eastAsia="Courier New" w:hAnsi="Courier New"/>
-                <w:b/>
-                <w:bCs/>
-                <w:sz w:val="18"/>
-                <w:szCs w:val="18"/>
-                <w:highlight w:val="yellow"/>
-                <w:highlightCs w:val="yellow"/>
-              </w:rPr>
-              <w:t xml:space="preserve">[…]</w:t>
-            </w:r>
-          </w:p>
-        </w:tc>
-        <w:tc>
-          <w:tcPr>
-            <w:tcW w:type="dxa" w:w="2000"/>
-            <w:tcBorders>
-              <w:top w:val="single" w:color="BFBFBF" w:sz="1"/>
-              <w:left w:val="single" w:color="BFBFBF" w:sz="1"/>
-              <w:bottom w:val="single" w:color="BFBFBF" w:sz="1"/>
-              <w:right w:val="single" w:color="BFBFBF" w:sz="1"/>
-            </w:tcBorders>
-            <w:tcMar>
-              <w:top w:type="dxa" w:w="50"/>
-              <w:left w:type="dxa" w:w="90"/>
-              <w:bottom w:type="dxa" w:w="50"/>
-              <w:right w:type="dxa" w:w="90"/>
-            </w:tcMar>
-          </w:tcPr>
-          <w:p>
-            <w:pPr>
-              <w:spacing w:after="0" w:line="230"/>
-            </w:pPr>
-            <w:r>
-              <w:rPr>
-                <w:rFonts w:ascii="Courier New" w:cs="Courier New" w:eastAsia="Courier New" w:hAnsi="Courier New"/>
-                <w:b/>
-                <w:bCs/>
-                <w:sz w:val="18"/>
-                <w:szCs w:val="18"/>
-                <w:highlight w:val="yellow"/>
-                <w:highlightCs w:val="yellow"/>
-              </w:rPr>
-              <w:t xml:space="preserve">[…]</w:t>
-            </w:r>
-          </w:p>
-        </w:tc>
-        <w:tc>
-          <w:tcPr>
-            <w:tcW w:type="dxa" w:w="2000"/>
-            <w:tcBorders>
-              <w:top w:val="single" w:color="BFBFBF" w:sz="1"/>
-              <w:left w:val="single" w:color="BFBFBF" w:sz="1"/>
-              <w:bottom w:val="single" w:color="BFBFBF" w:sz="1"/>
-              <w:right w:val="single" w:color="BFBFBF" w:sz="1"/>
-            </w:tcBorders>
-            <w:tcMar>
-              <w:top w:type="dxa" w:w="50"/>
-              <w:left w:type="dxa" w:w="90"/>
-              <w:bottom w:type="dxa" w:w="50"/>
-              <w:right w:type="dxa" w:w="90"/>
-            </w:tcMar>
-          </w:tcPr>
-          <w:p>
-            <w:pPr>
-              <w:spacing w:after="0" w:line="230"/>
-            </w:pPr>
-            <w:r>
-              <w:rPr>
-                <w:rFonts w:ascii="Courier New" w:cs="Courier New" w:eastAsia="Courier New" w:hAnsi="Courier New"/>
-                <w:b/>
-                <w:bCs/>
-                <w:sz w:val="18"/>
-                <w:szCs w:val="18"/>
-                <w:highlight w:val="yellow"/>
-                <w:highlightCs w:val="yellow"/>
-              </w:rPr>
-              <w:t xml:space="preserve">[…]</w:t>
+            <w:tcW w:type="dxa" w:w="1500"/>
+            <w:tcBorders>
+              <w:top w:val="single" w:color="BFBFBF" w:sz="1"/>
+              <w:left w:val="single" w:color="BFBFBF" w:sz="1"/>
+              <w:bottom w:val="single" w:color="BFBFBF" w:sz="1"/>
+              <w:right w:val="single" w:color="BFBFBF" w:sz="1"/>
+            </w:tcBorders>
+            <w:tcMar>
+              <w:top w:type="dxa" w:w="50"/>
+              <w:left w:type="dxa" w:w="90"/>
+              <w:bottom w:type="dxa" w:w="50"/>
+              <w:right w:type="dxa" w:w="90"/>
+            </w:tcMar>
+          </w:tcPr>
+          <w:p>
+            <w:pPr>
+              <w:spacing w:after="0" w:line="230"/>
+            </w:pPr>
+            <w:r>
+              <w:rPr>
+                <w:rFonts w:ascii="Courier New" w:cs="Courier New" w:eastAsia="Courier New" w:hAnsi="Courier New"/>
+                <w:b w:val="false"/>
+                <w:bCs w:val="false"/>
+                <w:i w:val="false"/>
+                <w:iCs w:val="false"/>
+                <w:sz w:val="18"/>
+                <w:szCs w:val="18"/>
+              </w:rPr>
+              <w:t xml:space="preserve">A</w:t>
+            </w:r>
+          </w:p>
+        </w:tc>
+        <w:tc>
+          <w:tcPr>
+            <w:tcW w:type="dxa" w:w="1500"/>
+            <w:tcBorders>
+              <w:top w:val="single" w:color="BFBFBF" w:sz="1"/>
+              <w:left w:val="single" w:color="BFBFBF" w:sz="1"/>
+              <w:bottom w:val="single" w:color="BFBFBF" w:sz="1"/>
+              <w:right w:val="single" w:color="BFBFBF" w:sz="1"/>
+            </w:tcBorders>
+            <w:tcMar>
+              <w:top w:type="dxa" w:w="50"/>
+              <w:left w:type="dxa" w:w="90"/>
+              <w:bottom w:type="dxa" w:w="50"/>
+              <w:right w:type="dxa" w:w="90"/>
+            </w:tcMar>
+          </w:tcPr>
+          <w:p>
+            <w:pPr>
+              <w:spacing w:after="0" w:line="230"/>
+            </w:pPr>
+            <w:r>
+              <w:rPr>
+                <w:rFonts w:ascii="Courier New" w:cs="Courier New" w:eastAsia="Courier New" w:hAnsi="Courier New"/>
+                <w:b w:val="false"/>
+                <w:bCs w:val="false"/>
+                <w:i w:val="false"/>
+                <w:iCs w:val="false"/>
+                <w:sz w:val="18"/>
+                <w:szCs w:val="18"/>
+              </w:rPr>
+              <w:t xml:space="preserve">C</w:t>
+            </w:r>
+          </w:p>
+        </w:tc>
+        <w:tc>
+          <w:tcPr>
+            <w:tcW w:type="dxa" w:w="1500"/>
+            <w:tcBorders>
+              <w:top w:val="single" w:color="BFBFBF" w:sz="1"/>
+              <w:left w:val="single" w:color="BFBFBF" w:sz="1"/>
+              <w:bottom w:val="single" w:color="BFBFBF" w:sz="1"/>
+              <w:right w:val="single" w:color="BFBFBF" w:sz="1"/>
+            </w:tcBorders>
+            <w:tcMar>
+              <w:top w:type="dxa" w:w="50"/>
+              <w:left w:type="dxa" w:w="90"/>
+              <w:bottom w:type="dxa" w:w="50"/>
+              <w:right w:type="dxa" w:w="90"/>
+            </w:tcMar>
+          </w:tcPr>
+          <w:p>
+            <w:pPr>
+              <w:spacing w:after="0" w:line="230"/>
+            </w:pPr>
+            <w:r>
+              <w:rPr>
+                <w:rFonts w:ascii="Courier New" w:cs="Courier New" w:eastAsia="Courier New" w:hAnsi="Courier New"/>
+                <w:b w:val="false"/>
+                <w:bCs w:val="false"/>
+                <w:i w:val="false"/>
+                <w:iCs w:val="false"/>
+                <w:sz w:val="18"/>
+                <w:szCs w:val="18"/>
+              </w:rPr>
+              <w:t xml:space="preserve">R</w:t>
+            </w:r>
+          </w:p>
+        </w:tc>
+        <w:tc>
+          <w:tcPr>
+            <w:tcW w:type="dxa" w:w="1500"/>
+            <w:tcBorders>
+              <w:top w:val="single" w:color="BFBFBF" w:sz="1"/>
+              <w:left w:val="single" w:color="BFBFBF" w:sz="1"/>
+              <w:bottom w:val="single" w:color="BFBFBF" w:sz="1"/>
+              <w:right w:val="single" w:color="BFBFBF" w:sz="1"/>
+            </w:tcBorders>
+            <w:tcMar>
+              <w:top w:type="dxa" w:w="50"/>
+              <w:left w:type="dxa" w:w="90"/>
+              <w:bottom w:type="dxa" w:w="50"/>
+              <w:right w:type="dxa" w:w="90"/>
+            </w:tcMar>
+          </w:tcPr>
+          <w:p>
+            <w:pPr>
+              <w:spacing w:after="0" w:line="230"/>
+            </w:pPr>
+            <w:r>
+              <w:rPr>
+                <w:rFonts w:ascii="Courier New" w:cs="Courier New" w:eastAsia="Courier New" w:hAnsi="Courier New"/>
+                <w:b w:val="false"/>
+                <w:bCs w:val="false"/>
+                <w:i w:val="false"/>
+                <w:iCs w:val="false"/>
+                <w:sz w:val="18"/>
+                <w:szCs w:val="18"/>
+              </w:rPr>
+              <w:t xml:space="preserve">I</w:t>
             </w:r>
           </w:p>
         </w:tc>
@@ -7697,103 +7945,137 @@
         </w:tc>
         <w:tc>
           <w:tcPr>
-            <w:tcW w:type="dxa" w:w="2000"/>
-            <w:tcBorders>
-              <w:top w:val="single" w:color="BFBFBF" w:sz="1"/>
-              <w:left w:val="single" w:color="BFBFBF" w:sz="1"/>
-              <w:bottom w:val="single" w:color="BFBFBF" w:sz="1"/>
-              <w:right w:val="single" w:color="BFBFBF" w:sz="1"/>
-            </w:tcBorders>
-            <w:tcMar>
-              <w:top w:type="dxa" w:w="50"/>
-              <w:left w:type="dxa" w:w="90"/>
-              <w:bottom w:type="dxa" w:w="50"/>
-              <w:right w:type="dxa" w:w="90"/>
-            </w:tcMar>
-          </w:tcPr>
-          <w:p>
-            <w:pPr>
-              <w:spacing w:after="0" w:line="230"/>
-            </w:pPr>
-            <w:r>
-              <w:rPr>
-                <w:rFonts w:ascii="Courier New" w:cs="Courier New" w:eastAsia="Courier New" w:hAnsi="Courier New"/>
-                <w:b/>
-                <w:bCs/>
-                <w:sz w:val="18"/>
-                <w:szCs w:val="18"/>
-                <w:highlight w:val="yellow"/>
-                <w:highlightCs w:val="yellow"/>
-              </w:rPr>
-              <w:t xml:space="preserve">[…]</w:t>
-            </w:r>
-          </w:p>
-        </w:tc>
-        <w:tc>
-          <w:tcPr>
-            <w:tcW w:type="dxa" w:w="2000"/>
-            <w:tcBorders>
-              <w:top w:val="single" w:color="BFBFBF" w:sz="1"/>
-              <w:left w:val="single" w:color="BFBFBF" w:sz="1"/>
-              <w:bottom w:val="single" w:color="BFBFBF" w:sz="1"/>
-              <w:right w:val="single" w:color="BFBFBF" w:sz="1"/>
-            </w:tcBorders>
-            <w:tcMar>
-              <w:top w:type="dxa" w:w="50"/>
-              <w:left w:type="dxa" w:w="90"/>
-              <w:bottom w:type="dxa" w:w="50"/>
-              <w:right w:type="dxa" w:w="90"/>
-            </w:tcMar>
-          </w:tcPr>
-          <w:p>
-            <w:pPr>
-              <w:spacing w:after="0" w:line="230"/>
-            </w:pPr>
-            <w:r>
-              <w:rPr>
-                <w:rFonts w:ascii="Courier New" w:cs="Courier New" w:eastAsia="Courier New" w:hAnsi="Courier New"/>
-                <w:b/>
-                <w:bCs/>
-                <w:sz w:val="18"/>
-                <w:szCs w:val="18"/>
-                <w:highlight w:val="yellow"/>
-                <w:highlightCs w:val="yellow"/>
-              </w:rPr>
-              <w:t xml:space="preserve">[…]</w:t>
-            </w:r>
-          </w:p>
-        </w:tc>
-        <w:tc>
-          <w:tcPr>
-            <w:tcW w:type="dxa" w:w="2000"/>
-            <w:tcBorders>
-              <w:top w:val="single" w:color="BFBFBF" w:sz="1"/>
-              <w:left w:val="single" w:color="BFBFBF" w:sz="1"/>
-              <w:bottom w:val="single" w:color="BFBFBF" w:sz="1"/>
-              <w:right w:val="single" w:color="BFBFBF" w:sz="1"/>
-            </w:tcBorders>
-            <w:tcMar>
-              <w:top w:type="dxa" w:w="50"/>
-              <w:left w:type="dxa" w:w="90"/>
-              <w:bottom w:type="dxa" w:w="50"/>
-              <w:right w:type="dxa" w:w="90"/>
-            </w:tcMar>
-          </w:tcPr>
-          <w:p>
-            <w:pPr>
-              <w:spacing w:after="0" w:line="230"/>
-            </w:pPr>
-            <w:r>
-              <w:rPr>
-                <w:rFonts w:ascii="Courier New" w:cs="Courier New" w:eastAsia="Courier New" w:hAnsi="Courier New"/>
-                <w:b/>
-                <w:bCs/>
-                <w:sz w:val="18"/>
-                <w:szCs w:val="18"/>
-                <w:highlight w:val="yellow"/>
-                <w:highlightCs w:val="yellow"/>
-              </w:rPr>
-              <w:t xml:space="preserve">[…]</w:t>
+            <w:tcW w:type="dxa" w:w="1500"/>
+            <w:tcBorders>
+              <w:top w:val="single" w:color="BFBFBF" w:sz="1"/>
+              <w:left w:val="single" w:color="BFBFBF" w:sz="1"/>
+              <w:bottom w:val="single" w:color="BFBFBF" w:sz="1"/>
+              <w:right w:val="single" w:color="BFBFBF" w:sz="1"/>
+            </w:tcBorders>
+            <w:tcMar>
+              <w:top w:type="dxa" w:w="50"/>
+              <w:left w:type="dxa" w:w="90"/>
+              <w:bottom w:type="dxa" w:w="50"/>
+              <w:right w:type="dxa" w:w="90"/>
+            </w:tcMar>
+          </w:tcPr>
+          <w:p>
+            <w:pPr>
+              <w:spacing w:after="0" w:line="230"/>
+            </w:pPr>
+            <w:r>
+              <w:rPr>
+                <w:rFonts w:ascii="Courier New" w:cs="Courier New" w:eastAsia="Courier New" w:hAnsi="Courier New"/>
+                <w:b w:val="false"/>
+                <w:bCs w:val="false"/>
+                <w:i w:val="false"/>
+                <w:iCs w:val="false"/>
+                <w:sz w:val="18"/>
+                <w:szCs w:val="18"/>
+              </w:rPr>
+              <w:t xml:space="preserve">C</w:t>
+            </w:r>
+          </w:p>
+        </w:tc>
+        <w:tc>
+          <w:tcPr>
+            <w:tcW w:type="dxa" w:w="1500"/>
+            <w:tcBorders>
+              <w:top w:val="single" w:color="BFBFBF" w:sz="1"/>
+              <w:left w:val="single" w:color="BFBFBF" w:sz="1"/>
+              <w:bottom w:val="single" w:color="BFBFBF" w:sz="1"/>
+              <w:right w:val="single" w:color="BFBFBF" w:sz="1"/>
+            </w:tcBorders>
+            <w:tcMar>
+              <w:top w:type="dxa" w:w="50"/>
+              <w:left w:type="dxa" w:w="90"/>
+              <w:bottom w:type="dxa" w:w="50"/>
+              <w:right w:type="dxa" w:w="90"/>
+            </w:tcMar>
+          </w:tcPr>
+          <w:p>
+            <w:pPr>
+              <w:spacing w:after="0" w:line="230"/>
+            </w:pPr>
+            <w:r>
+              <w:rPr>
+                <w:rFonts w:ascii="Courier New" w:cs="Courier New" w:eastAsia="Courier New" w:hAnsi="Courier New"/>
+                <w:b w:val="false"/>
+                <w:bCs w:val="false"/>
+                <w:i w:val="false"/>
+                <w:iCs w:val="false"/>
+                <w:sz w:val="18"/>
+                <w:szCs w:val="18"/>
+              </w:rPr>
+              <w:t xml:space="preserve">R</w:t>
+            </w:r>
+          </w:p>
+        </w:tc>
+        <w:tc>
+          <w:tcPr>
+            <w:tcW w:type="dxa" w:w="1500"/>
+            <w:tcBorders>
+              <w:top w:val="single" w:color="BFBFBF" w:sz="1"/>
+              <w:left w:val="single" w:color="BFBFBF" w:sz="1"/>
+              <w:bottom w:val="single" w:color="BFBFBF" w:sz="1"/>
+              <w:right w:val="single" w:color="BFBFBF" w:sz="1"/>
+            </w:tcBorders>
+            <w:tcMar>
+              <w:top w:type="dxa" w:w="50"/>
+              <w:left w:type="dxa" w:w="90"/>
+              <w:bottom w:type="dxa" w:w="50"/>
+              <w:right w:type="dxa" w:w="90"/>
+            </w:tcMar>
+          </w:tcPr>
+          <w:p>
+            <w:pPr>
+              <w:spacing w:after="0" w:line="230"/>
+            </w:pPr>
+            <w:r>
+              <w:rPr>
+                <w:rFonts w:ascii="Courier New" w:cs="Courier New" w:eastAsia="Courier New" w:hAnsi="Courier New"/>
+                <w:b w:val="false"/>
+                <w:bCs w:val="false"/>
+                <w:i w:val="false"/>
+                <w:iCs w:val="false"/>
+                <w:sz w:val="18"/>
+                <w:szCs w:val="18"/>
+              </w:rPr>
+              <w:t xml:space="preserve">I</w:t>
+            </w:r>
+          </w:p>
+        </w:tc>
+        <w:tc>
+          <w:tcPr>
+            <w:tcW w:type="dxa" w:w="1500"/>
+            <w:tcBorders>
+              <w:top w:val="single" w:color="BFBFBF" w:sz="1"/>
+              <w:left w:val="single" w:color="BFBFBF" w:sz="1"/>
+              <w:bottom w:val="single" w:color="BFBFBF" w:sz="1"/>
+              <w:right w:val="single" w:color="BFBFBF" w:sz="1"/>
+            </w:tcBorders>
+            <w:tcMar>
+              <w:top w:type="dxa" w:w="50"/>
+              <w:left w:type="dxa" w:w="90"/>
+              <w:bottom w:type="dxa" w:w="50"/>
+              <w:right w:type="dxa" w:w="90"/>
+            </w:tcMar>
+          </w:tcPr>
+          <w:p>
+            <w:pPr>
+              <w:spacing w:after="0" w:line="230"/>
+            </w:pPr>
+            <w:r>
+              <w:rPr>
+                <w:rFonts w:ascii="Courier New" w:cs="Courier New" w:eastAsia="Courier New" w:hAnsi="Courier New"/>
+                <w:b w:val="false"/>
+                <w:bCs w:val="false"/>
+                <w:i w:val="false"/>
+                <w:iCs w:val="false"/>
+                <w:sz w:val="18"/>
+                <w:szCs w:val="18"/>
+              </w:rPr>
+              <w:t xml:space="preserve">A</w:t>
             </w:r>
           </w:p>
         </w:tc>
@@ -7815,7 +8097,7 @@
           <w:sz w:val="18"/>
           <w:szCs w:val="18"/>
         </w:rPr>
-        <w:t xml:space="preserve">Tablo 5.1. RACI sorumluluk matrisi (takımca doldurulacak).</w:t>
+        <w:t xml:space="preserve">Tablo 5.1. RACI sorumluluk matrisi (R=Sorumlu, A=Onaylayan, C=Danışılan, I=Bilgilendirilen).</w:t>
       </w:r>
     </w:p>
     <w:p>
@@ -8017,13 +8299,25 @@
           <w:sz w:val="20"/>
           <w:szCs w:val="20"/>
         </w:rPr>
-        <w:t xml:space="preserve">Öğrenci 1</w:t>
+        <w:t xml:space="preserve">Fatih Karaca</w:t>
       </w:r>
     </w:p>
     <w:p>
       <w:pPr>
         <w:spacing w:after="60" w:before="0" w:line="264"/>
       </w:pPr>
+      <w:r>
+        <w:rPr>
+          <w:rFonts w:ascii="Courier New" w:cs="Courier New" w:eastAsia="Courier New" w:hAnsi="Courier New"/>
+          <w:b w:val="false"/>
+          <w:bCs w:val="false"/>
+          <w:i w:val="false"/>
+          <w:iCs w:val="false"/>
+          <w:sz w:val="20"/>
+          <w:szCs w:val="20"/>
+        </w:rPr>
+        <w:t xml:space="preserve">Öğrenci No: </w:t>
+      </w:r>
       <w:r>
         <w:rPr>
           <w:rFonts w:ascii="Courier New" w:cs="Courier New" w:eastAsia="Courier New" w:hAnsi="Courier New"/>
@@ -8036,7 +8330,7 @@
           <w:highlight w:val="yellow"/>
           <w:highlightCs w:val="yellow"/>
         </w:rPr>
-        <w:t xml:space="preserve">[Ad Soyad — Öğrenci No]</w:t>
+        <w:t xml:space="preserve">[Öğrenci No]</w:t>
       </w:r>
     </w:p>
     <w:p>
@@ -8055,7 +8349,7 @@
           <w:highlight w:val="yellow"/>
           <w:highlightCs w:val="yellow"/>
         </w:rPr>
-        <w:t xml:space="preserve">[Bağımsız tasarladığım modül(ler) ve çözdüğüm en büyük teknik problem — detaylıca yazın.]</w:t>
+        <w:t xml:space="preserve">[Bağımsız tasarladığım modül(ler) ve bu süreçte tek başıma çözdüğüm en büyük teknik problem — detaylıca yazın.]</w:t>
       </w:r>
     </w:p>
     <w:p>
@@ -8104,13 +8398,25 @@
           <w:sz w:val="20"/>
           <w:szCs w:val="20"/>
         </w:rPr>
-        <w:t xml:space="preserve">Öğrenci 2</w:t>
+        <w:t xml:space="preserve">Şeyma Keser</w:t>
       </w:r>
     </w:p>
     <w:p>
       <w:pPr>
         <w:spacing w:after="60" w:before="0" w:line="264"/>
       </w:pPr>
+      <w:r>
+        <w:rPr>
+          <w:rFonts w:ascii="Courier New" w:cs="Courier New" w:eastAsia="Courier New" w:hAnsi="Courier New"/>
+          <w:b w:val="false"/>
+          <w:bCs w:val="false"/>
+          <w:i w:val="false"/>
+          <w:iCs w:val="false"/>
+          <w:sz w:val="20"/>
+          <w:szCs w:val="20"/>
+        </w:rPr>
+        <w:t xml:space="preserve">Öğrenci No: </w:t>
+      </w:r>
       <w:r>
         <w:rPr>
           <w:rFonts w:ascii="Courier New" w:cs="Courier New" w:eastAsia="Courier New" w:hAnsi="Courier New"/>
@@ -8123,7 +8429,7 @@
           <w:highlight w:val="yellow"/>
           <w:highlightCs w:val="yellow"/>
         </w:rPr>
-        <w:t xml:space="preserve">[Ad Soyad — Öğrenci No]</w:t>
+        <w:t xml:space="preserve">[Öğrenci No]</w:t>
       </w:r>
     </w:p>
     <w:p>
@@ -8142,7 +8448,7 @@
           <w:highlight w:val="yellow"/>
           <w:highlightCs w:val="yellow"/>
         </w:rPr>
-        <w:t xml:space="preserve">[Bağımsız tasarladığım modül(ler) ve çözdüğüm en büyük teknik problem — detaylıca yazın.]</w:t>
+        <w:t xml:space="preserve">[Bağımsız tasarladığım modül(ler) ve bu süreçte tek başıma çözdüğüm en büyük teknik problem — detaylıca yazın.]</w:t>
       </w:r>
     </w:p>
     <w:p>
@@ -8191,13 +8497,25 @@
           <w:sz w:val="20"/>
           <w:szCs w:val="20"/>
         </w:rPr>
-        <w:t xml:space="preserve">Öğrenci 3</w:t>
+        <w:t xml:space="preserve">Senanur Binek</w:t>
       </w:r>
     </w:p>
     <w:p>
       <w:pPr>
         <w:spacing w:after="60" w:before="0" w:line="264"/>
       </w:pPr>
+      <w:r>
+        <w:rPr>
+          <w:rFonts w:ascii="Courier New" w:cs="Courier New" w:eastAsia="Courier New" w:hAnsi="Courier New"/>
+          <w:b w:val="false"/>
+          <w:bCs w:val="false"/>
+          <w:i w:val="false"/>
+          <w:iCs w:val="false"/>
+          <w:sz w:val="20"/>
+          <w:szCs w:val="20"/>
+        </w:rPr>
+        <w:t xml:space="preserve">Öğrenci No: </w:t>
+      </w:r>
       <w:r>
         <w:rPr>
           <w:rFonts w:ascii="Courier New" w:cs="Courier New" w:eastAsia="Courier New" w:hAnsi="Courier New"/>
@@ -8210,7 +8528,7 @@
           <w:highlight w:val="yellow"/>
           <w:highlightCs w:val="yellow"/>
         </w:rPr>
-        <w:t xml:space="preserve">[Ad Soyad — Öğrenci No]</w:t>
+        <w:t xml:space="preserve">[Öğrenci No]</w:t>
       </w:r>
     </w:p>
     <w:p>
@@ -8229,7 +8547,106 @@
           <w:highlight w:val="yellow"/>
           <w:highlightCs w:val="yellow"/>
         </w:rPr>
-        <w:t xml:space="preserve">[Bağımsız tasarladığım modül(ler) ve çözdüğüm en büyük teknik problem — detaylıca yazın.]</w:t>
+        <w:t xml:space="preserve">[Bağımsız tasarladığım modül(ler) ve bu süreçte tek başıma çözdüğüm en büyük teknik problem — detaylıca yazın.]</w:t>
+      </w:r>
+    </w:p>
+    <w:p>
+      <w:pPr>
+        <w:spacing w:after="160" w:before="0" w:line="264"/>
+      </w:pPr>
+      <w:r>
+        <w:rPr>
+          <w:rFonts w:ascii="Courier New" w:cs="Courier New" w:eastAsia="Courier New" w:hAnsi="Courier New"/>
+          <w:b w:val="false"/>
+          <w:bCs w:val="false"/>
+          <w:i w:val="false"/>
+          <w:iCs w:val="false"/>
+          <w:sz w:val="20"/>
+          <w:szCs w:val="20"/>
+        </w:rPr>
+        <w:t xml:space="preserve">İmza: </w:t>
+      </w:r>
+      <w:r>
+        <w:rPr>
+          <w:rFonts w:ascii="Courier New" w:cs="Courier New" w:eastAsia="Courier New" w:hAnsi="Courier New"/>
+          <w:b/>
+          <w:bCs/>
+          <w:i w:val="false"/>
+          <w:iCs w:val="false"/>
+          <w:sz w:val="20"/>
+          <w:szCs w:val="20"/>
+          <w:highlight w:val="yellow"/>
+          <w:highlightCs w:val="yellow"/>
+        </w:rPr>
+        <w:t xml:space="preserve">________________</w:t>
+      </w:r>
+    </w:p>
+    <w:p>
+      <w:pPr>
+        <w:pStyle w:val="Heading3"/>
+        <w:spacing w:after="80" w:before="140"/>
+      </w:pPr>
+      <w:r>
+        <w:rPr>
+          <w:rFonts w:ascii="Courier New" w:cs="Courier New" w:eastAsia="Courier New" w:hAnsi="Courier New"/>
+          <w:b/>
+          <w:bCs/>
+          <w:i w:val="false"/>
+          <w:iCs w:val="false"/>
+          <w:sz w:val="20"/>
+          <w:szCs w:val="20"/>
+        </w:rPr>
+        <w:t xml:space="preserve">Recep Sami Yeşersin</w:t>
+      </w:r>
+    </w:p>
+    <w:p>
+      <w:pPr>
+        <w:spacing w:after="60" w:before="0" w:line="264"/>
+      </w:pPr>
+      <w:r>
+        <w:rPr>
+          <w:rFonts w:ascii="Courier New" w:cs="Courier New" w:eastAsia="Courier New" w:hAnsi="Courier New"/>
+          <w:b w:val="false"/>
+          <w:bCs w:val="false"/>
+          <w:i w:val="false"/>
+          <w:iCs w:val="false"/>
+          <w:sz w:val="20"/>
+          <w:szCs w:val="20"/>
+        </w:rPr>
+        <w:t xml:space="preserve">Öğrenci No: </w:t>
+      </w:r>
+      <w:r>
+        <w:rPr>
+          <w:rFonts w:ascii="Courier New" w:cs="Courier New" w:eastAsia="Courier New" w:hAnsi="Courier New"/>
+          <w:b/>
+          <w:bCs/>
+          <w:i w:val="false"/>
+          <w:iCs w:val="false"/>
+          <w:sz w:val="20"/>
+          <w:szCs w:val="20"/>
+          <w:highlight w:val="yellow"/>
+          <w:highlightCs w:val="yellow"/>
+        </w:rPr>
+        <w:t xml:space="preserve">[Öğrenci No]</w:t>
+      </w:r>
+    </w:p>
+    <w:p>
+      <w:pPr>
+        <w:spacing w:after="60" w:before="0" w:line="264"/>
+      </w:pPr>
+      <w:r>
+        <w:rPr>
+          <w:rFonts w:ascii="Courier New" w:cs="Courier New" w:eastAsia="Courier New" w:hAnsi="Courier New"/>
+          <w:b/>
+          <w:bCs/>
+          <w:i w:val="false"/>
+          <w:iCs w:val="false"/>
+          <w:sz w:val="20"/>
+          <w:szCs w:val="20"/>
+          <w:highlight w:val="yellow"/>
+          <w:highlightCs w:val="yellow"/>
+        </w:rPr>
+        <w:t xml:space="preserve">[Bağımsız tasarladığım modül(ler) ve bu süreçte tek başıma çözdüğüm en büyük teknik problem — detaylıca yazın.]</w:t>
       </w:r>
     </w:p>
     <w:p>

</xml_diff>